<commit_message>
Updated the text according to the word document from my revisions during my summer holiday
</commit_message>
<xml_diff>
--- a/manuscript.docx
+++ b/manuscript.docx
@@ -500,7 +500,7 @@
       </w:r>
     </w:p>
     <w:bookmarkEnd w:id="26"/>
-    <w:bookmarkStart w:id="34" w:name="methods-1"/>
+    <w:bookmarkStart w:id="37" w:name="methods-1"/>
     <w:p>
       <w:pPr>
         <w:pStyle w:val="Heading1"/>
@@ -553,31 +553,7 @@
         <w:pStyle w:val="FirstParagraph"/>
       </w:pPr>
       <w:r>
-        <w:t xml:space="preserve">The trauma registry is comprised of patients treated at the Karolinska</w:t>
-      </w:r>
-      <w:r>
-        <w:t xml:space="preserve"> </w:t>
-      </w:r>
-      <w:r>
-        <w:t xml:space="preserve">University Hospital in Solna, which treats all major trauma in the</w:t>
-      </w:r>
-      <w:r>
-        <w:t xml:space="preserve"> </w:t>
-      </w:r>
-      <w:r>
-        <w:t xml:space="preserve">greater metropolitan area of Stockholm. We included patients registered</w:t>
-      </w:r>
-      <w:r>
-        <w:t xml:space="preserve"> </w:t>
-      </w:r>
-      <w:r>
-        <w:t xml:space="preserve">between 2014 and 2023. The trauma care quality database is a subset of</w:t>
-      </w:r>
-      <w:r>
-        <w:t xml:space="preserve"> </w:t>
-      </w:r>
-      <w:r>
-        <w:t xml:space="preserve">the trauma registry and includes patients selected for review.</w:t>
+        <w:t xml:space="preserve">The trauma registry includes patients treated at the Karolinska University Hospital in Solna, which treats all major trauma in the greater metropolitan area of Stockholm. We included patients registered between 2014 and 2023. The trauma care quality database is a subset of the trauma registry and includes patients selected for review of potential opportunities for improvement.</w:t>
       </w:r>
     </w:p>
     <w:bookmarkEnd w:id="28"/>
@@ -595,73 +571,94 @@
         <w:pStyle w:val="FirstParagraph"/>
       </w:pPr>
       <w:r>
-        <w:t xml:space="preserve">Inclusion in the trauma registry requires either admission through</w:t>
-      </w:r>
-      <w:r>
-        <w:t xml:space="preserve"> </w:t>
-      </w:r>
-      <w:r>
-        <w:t xml:space="preserve">trauma team activation or presenting with an Injury Severity Score (ISS)</w:t>
-      </w:r>
-      <w:r>
-        <w:t xml:space="preserve"> </w:t>
-      </w:r>
-      <w:r>
-        <w:t xml:space="preserve">greater than nine after admission to the Karolinska University Hospital.</w:t>
-      </w:r>
-      <w:r>
-        <w:t xml:space="preserve"> </w:t>
-      </w:r>
-      <w:r>
-        <w:t xml:space="preserve">Each trauma patient is then included in a morbidity and mortality review</w:t>
-      </w:r>
-      <w:r>
-        <w:t xml:space="preserve"> </w:t>
-      </w:r>
-      <w:r>
-        <w:t xml:space="preserve">process, which involves both individual case evaluations by specialized</w:t>
-      </w:r>
-      <w:r>
-        <w:t xml:space="preserve"> </w:t>
-      </w:r>
-      <w:r>
-        <w:t xml:space="preserve">nurses and audit filters. Patients identified with a high potential for</w:t>
-      </w:r>
-      <w:r>
-        <w:t xml:space="preserve"> </w:t>
-      </w:r>
-      <w:r>
-        <w:t xml:space="preserve">OFIs are discussed at multidisciplinary conferences. An OFI can be</w:t>
-      </w:r>
-      <w:r>
-        <w:t xml:space="preserve"> </w:t>
-      </w:r>
-      <w:r>
-        <w:t xml:space="preserve">various types of preventable events, and can be categorized as: clinical</w:t>
-      </w:r>
-      <w:r>
-        <w:t xml:space="preserve"> </w:t>
-      </w:r>
-      <w:r>
-        <w:t xml:space="preserve">judgment error, inadequate resources, delay in treatment, missed injury,</w:t>
-      </w:r>
-      <w:r>
-        <w:t xml:space="preserve"> </w:t>
-      </w:r>
-      <w:r>
-        <w:t xml:space="preserve">inadequate protocols, preventable death and other errors. The presence</w:t>
-      </w:r>
-      <w:r>
-        <w:t xml:space="preserve"> </w:t>
-      </w:r>
-      <w:r>
-        <w:t xml:space="preserve">or absence of OFIs is determined by consensus among all participants and</w:t>
-      </w:r>
-      <w:r>
-        <w:t xml:space="preserve"> </w:t>
-      </w:r>
-      <w:r>
-        <w:t xml:space="preserve">is documented in the trauma care quality database.</w:t>
+        <w:t xml:space="preserve">All patients in the trauma registry and trauma care quality database were included. Patients younger than 15 years and those who were dead on arrival were excluded. Inclusion in the trauma registry requires either admission through trauma team activation or presenting with an Injury Severity Score (ISS) greater than nine after admission to the Karolinska University Hospital. Each trauma patient is then included in a morbidity and mortality review process, which involves both individual case evaluations by specialized nurses and audit filters. Patients identified with a high potential for OFIs are discussed at multidisciplinary conferences. The presence or absence of OFIs is determined by consensus among all participants and is documented in the trauma care quality database.</w:t>
+      </w:r>
+    </w:p>
+    <w:bookmarkEnd w:id="29"/>
+    <w:bookmarkStart w:id="32" w:name="variables-and-data-sourcesmeasurements"/>
+    <w:p>
+      <w:pPr>
+        <w:pStyle w:val="Heading2"/>
+      </w:pPr>
+      <w:r>
+        <w:t xml:space="preserve">Variables and data sources/measurements</w:t>
+      </w:r>
+    </w:p>
+    <w:bookmarkStart w:id="30" w:name="outcome"/>
+    <w:p>
+      <w:pPr>
+        <w:pStyle w:val="Heading3"/>
+      </w:pPr>
+      <w:r>
+        <w:t xml:space="preserve">Outcome</w:t>
+      </w:r>
+    </w:p>
+    <w:p>
+      <w:pPr>
+        <w:pStyle w:val="FirstParagraph"/>
+      </w:pPr>
+      <w:r>
+        <w:t xml:space="preserve">The outcome was the presence of at least one OFI, determined by the multidisciplinary mortality and morbidity conference in the trauma care quality registry. OFI are defined as</w:t>
+      </w:r>
+      <w:r>
+        <w:t xml:space="preserve"> </w:t>
+      </w:r>
+      <w:r>
+        <w:t xml:space="preserve">“</w:t>
+      </w:r>
+      <w:r>
+        <w:t xml:space="preserve">preventable events in patient care with adverse outcomes</w:t>
+      </w:r>
+      <w:r>
+        <w:t xml:space="preserve">”</w:t>
+      </w:r>
+      <w:r>
+        <w:t xml:space="preserve">, and can be categorized as: clinical judgment error, inadequate resources, delay in treatment, missed injury, inadequate protocols, preventable death and other errors.</w:t>
+      </w:r>
+    </w:p>
+    <w:bookmarkEnd w:id="30"/>
+    <w:bookmarkStart w:id="31" w:name="exposure"/>
+    <w:p>
+      <w:pPr>
+        <w:pStyle w:val="Heading3"/>
+      </w:pPr>
+      <w:r>
+        <w:t xml:space="preserve">Exposure</w:t>
+      </w:r>
+    </w:p>
+    <w:p>
+      <w:pPr>
+        <w:pStyle w:val="FirstParagraph"/>
+      </w:pPr>
+      <w:r>
+        <w:t xml:space="preserve">The patients were classified to different degrees of shock according to two different classifications adapted from the 10th edition of the Advanced Trauma Life Support guidelines: one based on systolic blood pressure (SBP) and one based on base excess (BE). Table 1 shows the original ATLS categorisation whereas table 2 shows how we defined shock according to BE and SBP. The BE parameter was divided into four classes with these cutoffs: Class I (above -2), Class II (-2 to -6), Class III (-6 to -10), and Class IV (below -10). Similarly, SBP was divided into four classes: Class I (above 110 mmHg), Class II (109-100 mmHg), Class III (99-90 mmHg), and Class IV (below 90 mmHg). This classification follows the tenth edition ATLS hemorrhage classification</w:t>
+      </w:r>
+      <w:r>
+        <w:t xml:space="preserve"> </w:t>
+      </w:r>
+      <w:r>
+        <w:t xml:space="preserve">(9)</w:t>
+      </w:r>
+      <w:r>
+        <w:t xml:space="preserve">, which does not specify exact values for any parameter other than BE. To solve this, we assigned numerical SBP values to each class based on findings from Eastridge et al. and Oyetunji et al., who redefined hypotension as 110 mmHg respective 90 mmHg dependent on age</w:t>
+      </w:r>
+      <w:r>
+        <w:t xml:space="preserve"> </w:t>
+      </w:r>
+      <w:r>
+        <w:t xml:space="preserve">(10,11)</w:t>
+      </w:r>
+      <w:r>
+        <w:t xml:space="preserve">. Therefore, we used 110 mmHg as the lower limit for (Class I: no shock) - (ATLS: normal SBP) and below 90 mmHg for (Class IV: clear shock) - (ATLS: clear hypotension), class 2 and 3 divided equally in between. This also aligns with the classification done by Mutschler et al.</w:t>
+      </w:r>
+      <w:r>
+        <w:t xml:space="preserve"> </w:t>
+      </w:r>
+      <w:r>
+        <w:t xml:space="preserve">(12)</w:t>
+      </w:r>
+      <w:r>
+        <w:t xml:space="preserve">. The cause of shock was not accounted for.</w:t>
       </w:r>
     </w:p>
     <w:p>
@@ -669,99 +666,7 @@
         <w:pStyle w:val="BodyText"/>
       </w:pPr>
       <w:r>
-        <w:t xml:space="preserve">All patients in the trauma registry and trauma care quality database</w:t>
-      </w:r>
-      <w:r>
-        <w:t xml:space="preserve"> </w:t>
-      </w:r>
-      <w:r>
-        <w:t xml:space="preserve">were included. Patients younger than 15 and/or were dead on arrival were</w:t>
-      </w:r>
-      <w:r>
-        <w:t xml:space="preserve"> </w:t>
-      </w:r>
-      <w:r>
-        <w:t xml:space="preserve">excluded.</w:t>
-      </w:r>
-    </w:p>
-    <w:bookmarkEnd w:id="29"/>
-    <w:bookmarkStart w:id="30" w:name="variables-and-data-sourcesmeasurements"/>
-    <w:p>
-      <w:pPr>
-        <w:pStyle w:val="Heading2"/>
-      </w:pPr>
-      <w:r>
-        <w:t xml:space="preserve">Variables and data sources/measurements</w:t>
-      </w:r>
-    </w:p>
-    <w:p>
-      <w:pPr>
-        <w:pStyle w:val="FirstParagraph"/>
-      </w:pPr>
-      <w:r>
-        <w:t xml:space="preserve">The outcome was defined as the presence of at least one OFI, determined</w:t>
-      </w:r>
-      <w:r>
-        <w:t xml:space="preserve"> </w:t>
-      </w:r>
-      <w:r>
-        <w:t xml:space="preserve">by the multidisciplinary M&amp;M conference in the trauma care quality</w:t>
-      </w:r>
-      <w:r>
-        <w:t xml:space="preserve"> </w:t>
-      </w:r>
-      <w:r>
-        <w:t xml:space="preserve">registry. An OFI can be various types of preventable events, and can be</w:t>
-      </w:r>
-      <w:r>
-        <w:t xml:space="preserve"> </w:t>
-      </w:r>
-      <w:r>
-        <w:t xml:space="preserve">categorized as: clinical judgment error, inadequate resources, delay in</w:t>
-      </w:r>
-      <w:r>
-        <w:t xml:space="preserve"> </w:t>
-      </w:r>
-      <w:r>
-        <w:t xml:space="preserve">treatment, missed injury, inadequate protocols, preventable death and</w:t>
-      </w:r>
-      <w:r>
-        <w:t xml:space="preserve"> </w:t>
-      </w:r>
-      <w:r>
-        <w:t xml:space="preserve">other errors.</w:t>
-      </w:r>
-    </w:p>
-    <w:p>
-      <w:pPr>
-        <w:pStyle w:val="BodyText"/>
-      </w:pPr>
-      <w:r>
-        <w:t xml:space="preserve">The patients will be classified to different degrees of shock in</w:t>
-      </w:r>
-      <w:r>
-        <w:t xml:space="preserve"> </w:t>
-      </w:r>
-      <w:r>
-        <w:t xml:space="preserve">parallel and separately, once with systolic blood pressure (SBP) and</w:t>
-      </w:r>
-      <w:r>
-        <w:t xml:space="preserve"> </w:t>
-      </w:r>
-      <w:r>
-        <w:t xml:space="preserve">once with base excess (BE), regardless of their cause of shock. Based on</w:t>
-      </w:r>
-      <w:r>
-        <w:t xml:space="preserve"> </w:t>
-      </w:r>
-      <w:r>
-        <w:t xml:space="preserve">these two parameters, the patients will be classified into four classes</w:t>
-      </w:r>
-      <w:r>
-        <w:t xml:space="preserve"> </w:t>
-      </w:r>
-      <w:r>
-        <w:t xml:space="preserve">roughly based on the ATLS trauma shock classifications (See Table</w:t>
+        <w:t xml:space="preserve">(See Table</w:t>
       </w:r>
       <w:r>
         <w:t xml:space="preserve"> </w:t>
@@ -1473,34 +1378,15 @@
         </w:tc>
       </w:tr>
     </w:tbl>
-    <w:p>
-      <w:pPr>
-        <w:pStyle w:val="BodyText"/>
-      </w:pPr>
-      <w:r>
-        <w:t xml:space="preserve">We included five other metrics to be adjusted for, due to potential for</w:t>
-      </w:r>
-      <w:r>
-        <w:t xml:space="preserve"> </w:t>
-      </w:r>
-      <w:r>
-        <w:t xml:space="preserve">confounding. Pre-injury ASA and gender were categorical, meanwhile age,</w:t>
-      </w:r>
-      <w:r>
-        <w:t xml:space="preserve"> </w:t>
-      </w:r>
-      <w:r>
-        <w:t xml:space="preserve">ISS and INR were kept continuous.</w:t>
-      </w:r>
-    </w:p>
-    <w:bookmarkEnd w:id="30"/>
-    <w:bookmarkStart w:id="31" w:name="study-size"/>
+    <w:bookmarkEnd w:id="31"/>
+    <w:bookmarkEnd w:id="32"/>
+    <w:bookmarkStart w:id="34" w:name="quantitative-variables"/>
     <w:p>
       <w:pPr>
         <w:pStyle w:val="Heading2"/>
       </w:pPr>
       <w:r>
-        <w:t xml:space="preserve">Study size</w:t>
+        <w:t xml:space="preserve">Quantitative variables</w:t>
       </w:r>
     </w:p>
     <w:p>
@@ -1508,148 +1394,7 @@
         <w:pStyle w:val="FirstParagraph"/>
       </w:pPr>
       <w:r>
-        <w:t xml:space="preserve">All available data in trauma registry and trauma care quality database</w:t>
-      </w:r>
-      <w:r>
-        <w:t xml:space="preserve"> </w:t>
-      </w:r>
-      <w:r>
-        <w:t xml:space="preserve">will be included.</w:t>
-      </w:r>
-    </w:p>
-    <w:bookmarkEnd w:id="31"/>
-    <w:bookmarkStart w:id="32" w:name="quantitative-variables"/>
-    <w:p>
-      <w:pPr>
-        <w:pStyle w:val="Heading2"/>
-      </w:pPr>
-      <w:r>
-        <w:t xml:space="preserve">Quantitative variables</w:t>
-      </w:r>
-    </w:p>
-    <w:p>
-      <w:pPr>
-        <w:pStyle w:val="FirstParagraph"/>
-      </w:pPr>
-      <w:r>
-        <w:t xml:space="preserve">Table @ref(tab:mod-atls) shows how we defined shock according to BE and</w:t>
-      </w:r>
-      <w:r>
-        <w:t xml:space="preserve"> </w:t>
-      </w:r>
-      <w:r>
-        <w:t xml:space="preserve">SBP. The BE parameter was divided into four classes with these cutoffs:</w:t>
-      </w:r>
-      <w:r>
-        <w:t xml:space="preserve"> </w:t>
-      </w:r>
-      <w:r>
-        <w:t xml:space="preserve">Class I (above -2), Class II (-2 to -6), Class III (-6 to -10), and</w:t>
-      </w:r>
-      <w:r>
-        <w:t xml:space="preserve"> </w:t>
-      </w:r>
-      <w:r>
-        <w:t xml:space="preserve">Class IV (below -10). Similarly, SBP was divided into four classes:</w:t>
-      </w:r>
-      <w:r>
-        <w:t xml:space="preserve"> </w:t>
-      </w:r>
-      <w:r>
-        <w:t xml:space="preserve">Class I (above 110 mmHg), Class II (109-100 mmHg), Class III (99-90</w:t>
-      </w:r>
-      <w:r>
-        <w:t xml:space="preserve"> </w:t>
-      </w:r>
-      <w:r>
-        <w:t xml:space="preserve">mmHg), and Class IV (below 90 mmHg). This classification follows the</w:t>
-      </w:r>
-      <w:r>
-        <w:t xml:space="preserve"> </w:t>
-      </w:r>
-      <w:r>
-        <w:t xml:space="preserve">tenth edition ATLS hemorrhage classification</w:t>
-      </w:r>
-      <w:r>
-        <w:t xml:space="preserve"> </w:t>
-      </w:r>
-      <w:r>
-        <w:t xml:space="preserve">(9)</w:t>
-      </w:r>
-      <w:r>
-        <w:t xml:space="preserve">,</w:t>
-      </w:r>
-      <w:r>
-        <w:t xml:space="preserve"> </w:t>
-      </w:r>
-      <w:r>
-        <w:t xml:space="preserve">which does not specify exact values for any parameter other than BE. To</w:t>
-      </w:r>
-      <w:r>
-        <w:t xml:space="preserve"> </w:t>
-      </w:r>
-      <w:r>
-        <w:t xml:space="preserve">solve this, we assigned numerical SBP values to each class based on</w:t>
-      </w:r>
-      <w:r>
-        <w:t xml:space="preserve"> </w:t>
-      </w:r>
-      <w:r>
-        <w:t xml:space="preserve">findings from Eastridge et al. and Oyetunji et al., who redefined</w:t>
-      </w:r>
-      <w:r>
-        <w:t xml:space="preserve"> </w:t>
-      </w:r>
-      <w:r>
-        <w:t xml:space="preserve">hypotension as 110 mmHg respective 90 mmHg dependent on</w:t>
-      </w:r>
-      <w:r>
-        <w:t xml:space="preserve"> </w:t>
-      </w:r>
-      <w:r>
-        <w:t xml:space="preserve">age</w:t>
-      </w:r>
-      <w:r>
-        <w:t xml:space="preserve">(10,11)</w:t>
-      </w:r>
-      <w:r>
-        <w:t xml:space="preserve">. Therefore,</w:t>
-      </w:r>
-      <w:r>
-        <w:t xml:space="preserve"> </w:t>
-      </w:r>
-      <w:r>
-        <w:t xml:space="preserve">we used 110 mmHg as the lower limit for (Class I: no shock) - (ATLS:</w:t>
-      </w:r>
-      <w:r>
-        <w:t xml:space="preserve"> </w:t>
-      </w:r>
-      <w:r>
-        <w:t xml:space="preserve">normal SBP) and below 90 mmHg for (Class IV: clear shock) - (ATLS: clear</w:t>
-      </w:r>
-      <w:r>
-        <w:t xml:space="preserve"> </w:t>
-      </w:r>
-      <w:r>
-        <w:t xml:space="preserve">hypotension), class 2 and 3 divided equally in between. This also aligns</w:t>
-      </w:r>
-      <w:r>
-        <w:t xml:space="preserve"> </w:t>
-      </w:r>
-      <w:r>
-        <w:t xml:space="preserve">with the classification done by Mutschler et</w:t>
-      </w:r>
-      <w:r>
-        <w:t xml:space="preserve"> </w:t>
-      </w:r>
-      <w:r>
-        <w:t xml:space="preserve">al.</w:t>
-      </w:r>
-      <w:r>
-        <w:t xml:space="preserve">(12)</w:t>
-      </w:r>
-      <w:r>
-        <w:t xml:space="preserve">.</w:t>
+        <w:t xml:space="preserve">Table 2 shows how</w:t>
       </w:r>
     </w:p>
     <w:p>
@@ -2059,14 +1804,13 @@
         <w:t xml:space="preserve">BE).</w:t>
       </w:r>
     </w:p>
-    <w:bookmarkEnd w:id="32"/>
-    <w:bookmarkStart w:id="33" w:name="statistical-methods"/>
-    <w:p>
-      <w:pPr>
-        <w:pStyle w:val="Heading2"/>
-      </w:pPr>
-      <w:r>
-        <w:t xml:space="preserve">Statistical methods</w:t>
+    <w:bookmarkStart w:id="33" w:name="additional-covariates"/>
+    <w:p>
+      <w:pPr>
+        <w:pStyle w:val="Heading3"/>
+      </w:pPr>
+      <w:r>
+        <w:t xml:space="preserve">Additional covariates</w:t>
       </w:r>
     </w:p>
     <w:p>
@@ -2074,90 +1818,55 @@
         <w:pStyle w:val="FirstParagraph"/>
       </w:pPr>
       <w:r>
-        <w:t xml:space="preserve">The statistical analysis was performed using R, a programming language</w:t>
-      </w:r>
-      <w:r>
-        <w:t xml:space="preserve"> </w:t>
-      </w:r>
-      <w:r>
-        <w:t xml:space="preserve">and environment for statistical computing. OFI subcategories were</w:t>
-      </w:r>
-      <w:r>
-        <w:t xml:space="preserve"> </w:t>
-      </w:r>
-      <w:r>
-        <w:t xml:space="preserve">presented as percentage distributions and visualized in a bar chart.</w:t>
-      </w:r>
-      <w:r>
-        <w:t xml:space="preserve"> </w:t>
-      </w:r>
-      <w:r>
-        <w:t xml:space="preserve">Bivariable logistic regression was used to determine the unadjusted</w:t>
-      </w:r>
-      <w:r>
-        <w:t xml:space="preserve"> </w:t>
-      </w:r>
-      <w:r>
-        <w:t xml:space="preserve">association between the OFI, and degree of shock defined by BE and SBP</w:t>
-      </w:r>
-      <w:r>
-        <w:t xml:space="preserve"> </w:t>
-      </w:r>
-      <w:r>
-        <w:t xml:space="preserve">classifications. Multivariable logistic regression incorporated and</w:t>
-      </w:r>
-      <w:r>
-        <w:t xml:space="preserve"> </w:t>
-      </w:r>
-      <w:r>
-        <w:t xml:space="preserve">adjusted for other patient factors such as age, sex, preinjury ASA, INR,</w:t>
-      </w:r>
-      <w:r>
-        <w:t xml:space="preserve"> </w:t>
-      </w:r>
-      <w:r>
-        <w:t xml:space="preserve">and ISS. It was presented as odds ratios (OR) between the presence of</w:t>
-      </w:r>
-      <w:r>
-        <w:t xml:space="preserve"> </w:t>
-      </w:r>
-      <w:r>
-        <w:t xml:space="preserve">OFI, and shock classes. The OR was determined with 95% confidence</w:t>
-      </w:r>
-      <w:r>
-        <w:t xml:space="preserve"> </w:t>
-      </w:r>
-      <w:r>
-        <w:t xml:space="preserve">intervals, and a significance level of 5% was used. All statistical</w:t>
-      </w:r>
-      <w:r>
-        <w:t xml:space="preserve"> </w:t>
-      </w:r>
-      <w:r>
-        <w:t xml:space="preserve">analysis was first done on synthetic data and then later implemented on</w:t>
-      </w:r>
-      <w:r>
-        <w:t xml:space="preserve"> </w:t>
-      </w:r>
-      <w:r>
-        <w:t xml:space="preserve">the data collected from the trauma registry and the trauma care quality</w:t>
-      </w:r>
-      <w:r>
-        <w:t xml:space="preserve"> </w:t>
-      </w:r>
-      <w:r>
-        <w:t xml:space="preserve">database to ensure objectivity. Missing data was addressed by listwise</w:t>
-      </w:r>
-      <w:r>
-        <w:t xml:space="preserve"> </w:t>
-      </w:r>
-      <w:r>
-        <w:t xml:space="preserve">deletion.</w:t>
+        <w:t xml:space="preserve">We included five additional covariates: Pre-injury ASA and gender were included as categorical variables, and age, ISS and INR were kept as continuous variables.</w:t>
       </w:r>
     </w:p>
     <w:bookmarkEnd w:id="33"/>
     <w:bookmarkEnd w:id="34"/>
-    <w:bookmarkStart w:id="92" w:name="results-1"/>
+    <w:bookmarkStart w:id="35" w:name="study-size"/>
+    <w:p>
+      <w:pPr>
+        <w:pStyle w:val="Heading2"/>
+      </w:pPr>
+      <w:r>
+        <w:t xml:space="preserve">Study size</w:t>
+      </w:r>
+    </w:p>
+    <w:p>
+      <w:pPr>
+        <w:pStyle w:val="FirstParagraph"/>
+      </w:pPr>
+      <w:r>
+        <w:t xml:space="preserve">All available data in trauma registry and trauma care quality database</w:t>
+      </w:r>
+      <w:r>
+        <w:t xml:space="preserve"> </w:t>
+      </w:r>
+      <w:r>
+        <w:t xml:space="preserve">will be included.</w:t>
+      </w:r>
+    </w:p>
+    <w:bookmarkEnd w:id="35"/>
+    <w:bookmarkStart w:id="36" w:name="statistical-methods"/>
+    <w:p>
+      <w:pPr>
+        <w:pStyle w:val="Heading2"/>
+      </w:pPr>
+      <w:r>
+        <w:t xml:space="preserve">Statistical methods</w:t>
+      </w:r>
+    </w:p>
+    <w:p>
+      <w:pPr>
+        <w:pStyle w:val="FirstParagraph"/>
+      </w:pPr>
+      <w:r>
+        <w:t xml:space="preserve">The statistical analysis was performed using R version 4.5.1, a programming language and environment for statistical computing. OFI subcategories were presented as percentage distributions and visualized in a bar chart. Bivariable logistic regression was used to determine the unadjusted association between the degree of shock and OFI, for each of the BE and SBP classifications. Multivariable logistic regression incorporated and adjusted for the potential confounders patient factors such as age, sex, preinjury ASA, INR, and ISS. It was presented as odds ratios (OR) between the presence of OFI, and shock classes. The OR was determined with 95% confidence intervals, and a significance level of 5% was used. All statistical analysis was first done on synthetic data and then later implemented on the data collected from the trauma registry and the trauma care quality database to ensure objectivity. Missing data was addressed by listwise deletion.</w:t>
+      </w:r>
+    </w:p>
+    <w:bookmarkEnd w:id="36"/>
+    <w:bookmarkEnd w:id="37"/>
+    <w:bookmarkStart w:id="93" w:name="results-1"/>
     <w:p>
       <w:pPr>
         <w:pStyle w:val="Heading1"/>
@@ -2166,7 +1875,7 @@
         <w:t xml:space="preserve">Results</w:t>
       </w:r>
     </w:p>
-    <w:bookmarkStart w:id="35" w:name="dcyuvylhty"/>
+    <w:bookmarkStart w:id="38" w:name="qosxjgaphs"/>
     <w:p>
       <w:pPr>
         <w:pStyle w:val="FirstParagraph"/>
@@ -2645,8 +2354,8 @@
         <w:t xml:space="preserve">n (%)</w:t>
       </w:r>
     </w:p>
-    <w:bookmarkEnd w:id="35"/>
-    <w:bookmarkStart w:id="36" w:name="hwcwikxjgd"/>
+    <w:bookmarkEnd w:id="38"/>
+    <w:bookmarkStart w:id="39" w:name="ogyukcxexa"/>
     <w:p>
       <w:pPr>
         <w:pStyle w:val="BodyText"/>
@@ -3125,8 +2834,8 @@
         <w:t xml:space="preserve">n (%)</w:t>
       </w:r>
     </w:p>
-    <w:bookmarkEnd w:id="36"/>
-    <w:bookmarkStart w:id="50" w:name="brwgqqhdlq"/>
+    <w:bookmarkEnd w:id="39"/>
+    <w:bookmarkStart w:id="53" w:name="krimkrcjvy"/>
     <w:p>
       <w:pPr>
         <w:pStyle w:val="BodyText"/>
@@ -4631,13 +4340,13 @@
         <w:t xml:space="preserve">Abbreviations: CI = Confidence Interval, OR = Odds Ratio</w:t>
       </w:r>
     </w:p>
-    <w:bookmarkStart w:id="37" w:name="mmkuvfatqx"/>
-    <w:p>
-      <w:pPr>
-        <w:pStyle w:val="BlockText"/>
-      </w:pPr>
-      <w:r>
-        <w:t xml:space="preserve">#mmkuvfatqx table {</w:t>
+    <w:bookmarkStart w:id="40" w:name="nglwkjudzt"/>
+    <w:p>
+      <w:pPr>
+        <w:pStyle w:val="BlockText"/>
+      </w:pPr>
+      <w:r>
+        <w:t xml:space="preserve">#nglwkjudzt table {</w:t>
       </w:r>
       <w:r>
         <w:t xml:space="preserve"> </w:t>
@@ -4739,13 +4448,13 @@
         <w:t xml:space="preserve">}</w:t>
       </w:r>
     </w:p>
-    <w:bookmarkEnd w:id="37"/>
+    <w:bookmarkEnd w:id="40"/>
     <w:p>
       <w:pPr>
         <w:pStyle w:val="FirstParagraph"/>
       </w:pPr>
       <w:r>
-        <w:t xml:space="preserve">#mmkuvfatqx thead, #mmkuvfatqx tbody, #mmkuvfatqx tfoot, #mmkuvfatqx tr, #mmkuvfatqx td, #mmkuvfatqx th {</w:t>
+        <w:t xml:space="preserve">#nglwkjudzt thead, #nglwkjudzt tbody, #nglwkjudzt tfoot, #nglwkjudzt tr, #nglwkjudzt td, #nglwkjudzt th {</w:t>
       </w:r>
       <w:r>
         <w:t xml:space="preserve"> </w:t>
@@ -4765,7 +4474,7 @@
         <w:pStyle w:val="BodyText"/>
       </w:pPr>
       <w:r>
-        <w:t xml:space="preserve">#mmkuvfatqx p {</w:t>
+        <w:t xml:space="preserve">#nglwkjudzt p {</w:t>
       </w:r>
       <w:r>
         <w:t xml:space="preserve"> </w:t>
@@ -4791,7 +4500,7 @@
         <w:pStyle w:val="BodyText"/>
       </w:pPr>
       <w:r>
-        <w:t xml:space="preserve">#mmkuvfatqx .gt_table {</w:t>
+        <w:t xml:space="preserve">#nglwkjudzt .gt_table {</w:t>
       </w:r>
       <w:r>
         <w:t xml:space="preserve"> </w:t>
@@ -4943,7 +4652,7 @@
         <w:pStyle w:val="BodyText"/>
       </w:pPr>
       <w:r>
-        <w:t xml:space="preserve">#mmkuvfatqx .gt_caption {</w:t>
+        <w:t xml:space="preserve">#nglwkjudzt .gt_caption {</w:t>
       </w:r>
       <w:r>
         <w:t xml:space="preserve"> </w:t>
@@ -4969,7 +4678,7 @@
         <w:pStyle w:val="BodyText"/>
       </w:pPr>
       <w:r>
-        <w:t xml:space="preserve">#mmkuvfatqx .gt_title {</w:t>
+        <w:t xml:space="preserve">#nglwkjudzt .gt_title {</w:t>
       </w:r>
       <w:r>
         <w:t xml:space="preserve"> </w:t>
@@ -5037,7 +4746,7 @@
         <w:pStyle w:val="BodyText"/>
       </w:pPr>
       <w:r>
-        <w:t xml:space="preserve">#mmkuvfatqx .gt_subtitle {</w:t>
+        <w:t xml:space="preserve">#nglwkjudzt .gt_subtitle {</w:t>
       </w:r>
       <w:r>
         <w:t xml:space="preserve"> </w:t>
@@ -5105,7 +4814,7 @@
         <w:pStyle w:val="BodyText"/>
       </w:pPr>
       <w:r>
-        <w:t xml:space="preserve">#mmkuvfatqx .gt_heading {</w:t>
+        <w:t xml:space="preserve">#nglwkjudzt .gt_heading {</w:t>
       </w:r>
       <w:r>
         <w:t xml:space="preserve"> </w:t>
@@ -5173,7 +4882,7 @@
         <w:pStyle w:val="BodyText"/>
       </w:pPr>
       <w:r>
-        <w:t xml:space="preserve">#mmkuvfatqx .gt_bottom_border {</w:t>
+        <w:t xml:space="preserve">#nglwkjudzt .gt_bottom_border {</w:t>
       </w:r>
       <w:r>
         <w:t xml:space="preserve"> </w:t>
@@ -5205,7 +4914,7 @@
         <w:pStyle w:val="BodyText"/>
       </w:pPr>
       <w:r>
-        <w:t xml:space="preserve">#mmkuvfatqx .gt_col_headings {</w:t>
+        <w:t xml:space="preserve">#nglwkjudzt .gt_col_headings {</w:t>
       </w:r>
       <w:r>
         <w:t xml:space="preserve"> </w:t>
@@ -5291,7 +5000,7 @@
         <w:pStyle w:val="BodyText"/>
       </w:pPr>
       <w:r>
-        <w:t xml:space="preserve">#mmkuvfatqx .gt_col_heading {</w:t>
+        <w:t xml:space="preserve">#nglwkjudzt .gt_col_heading {</w:t>
       </w:r>
       <w:r>
         <w:t xml:space="preserve"> </w:t>
@@ -5407,7 +5116,7 @@
         <w:pStyle w:val="BodyText"/>
       </w:pPr>
       <w:r>
-        <w:t xml:space="preserve">#mmkuvfatqx .gt_column_spanner_outer {</w:t>
+        <w:t xml:space="preserve">#nglwkjudzt .gt_column_spanner_outer {</w:t>
       </w:r>
       <w:r>
         <w:t xml:space="preserve"> </w:t>
@@ -5475,7 +5184,7 @@
         <w:pStyle w:val="BodyText"/>
       </w:pPr>
       <w:r>
-        <w:t xml:space="preserve">#mmkuvfatqx .gt_column_spanner_outer:first-child {</w:t>
+        <w:t xml:space="preserve">#nglwkjudzt .gt_column_spanner_outer:first-child {</w:t>
       </w:r>
       <w:r>
         <w:t xml:space="preserve"> </w:t>
@@ -5495,7 +5204,7 @@
         <w:pStyle w:val="BodyText"/>
       </w:pPr>
       <w:r>
-        <w:t xml:space="preserve">#mmkuvfatqx .gt_column_spanner_outer:last-child {</w:t>
+        <w:t xml:space="preserve">#nglwkjudzt .gt_column_spanner_outer:last-child {</w:t>
       </w:r>
       <w:r>
         <w:t xml:space="preserve"> </w:t>
@@ -5515,7 +5224,7 @@
         <w:pStyle w:val="BodyText"/>
       </w:pPr>
       <w:r>
-        <w:t xml:space="preserve">#mmkuvfatqx .gt_column_spanner {</w:t>
+        <w:t xml:space="preserve">#nglwkjudzt .gt_column_spanner {</w:t>
       </w:r>
       <w:r>
         <w:t xml:space="preserve"> </w:t>
@@ -5583,7 +5292,7 @@
         <w:pStyle w:val="BodyText"/>
       </w:pPr>
       <w:r>
-        <w:t xml:space="preserve">#mmkuvfatqx .gt_spanner_row {</w:t>
+        <w:t xml:space="preserve">#nglwkjudzt .gt_spanner_row {</w:t>
       </w:r>
       <w:r>
         <w:t xml:space="preserve"> </w:t>
@@ -5603,7 +5312,7 @@
         <w:pStyle w:val="BodyText"/>
       </w:pPr>
       <w:r>
-        <w:t xml:space="preserve">#mmkuvfatqx .gt_group_heading {</w:t>
+        <w:t xml:space="preserve">#nglwkjudzt .gt_group_heading {</w:t>
       </w:r>
       <w:r>
         <w:t xml:space="preserve"> </w:t>
@@ -5755,7 +5464,7 @@
         <w:pStyle w:val="BodyText"/>
       </w:pPr>
       <w:r>
-        <w:t xml:space="preserve">#mmkuvfatqx .gt_empty_group_heading {</w:t>
+        <w:t xml:space="preserve">#nglwkjudzt .gt_empty_group_heading {</w:t>
       </w:r>
       <w:r>
         <w:t xml:space="preserve"> </w:t>
@@ -5841,7 +5550,7 @@
         <w:pStyle w:val="BodyText"/>
       </w:pPr>
       <w:r>
-        <w:t xml:space="preserve">#mmkuvfatqx .gt_from_md &gt; :first-child {</w:t>
+        <w:t xml:space="preserve">#nglwkjudzt .gt_from_md &gt; :first-child {</w:t>
       </w:r>
       <w:r>
         <w:t xml:space="preserve"> </w:t>
@@ -5861,7 +5570,7 @@
         <w:pStyle w:val="BodyText"/>
       </w:pPr>
       <w:r>
-        <w:t xml:space="preserve">#mmkuvfatqx .gt_from_md &gt; :last-child {</w:t>
+        <w:t xml:space="preserve">#nglwkjudzt .gt_from_md &gt; :last-child {</w:t>
       </w:r>
       <w:r>
         <w:t xml:space="preserve"> </w:t>
@@ -5881,7 +5590,7 @@
         <w:pStyle w:val="BodyText"/>
       </w:pPr>
       <w:r>
-        <w:t xml:space="preserve">#mmkuvfatqx .gt_row {</w:t>
+        <w:t xml:space="preserve">#nglwkjudzt .gt_row {</w:t>
       </w:r>
       <w:r>
         <w:t xml:space="preserve"> </w:t>
@@ -5991,7 +5700,7 @@
         <w:pStyle w:val="BodyText"/>
       </w:pPr>
       <w:r>
-        <w:t xml:space="preserve">#mmkuvfatqx .gt_stub {</w:t>
+        <w:t xml:space="preserve">#nglwkjudzt .gt_stub {</w:t>
       </w:r>
       <w:r>
         <w:t xml:space="preserve"> </w:t>
@@ -6065,7 +5774,7 @@
         <w:pStyle w:val="BodyText"/>
       </w:pPr>
       <w:r>
-        <w:t xml:space="preserve">#mmkuvfatqx .gt_stub_row_group {</w:t>
+        <w:t xml:space="preserve">#nglwkjudzt .gt_stub_row_group {</w:t>
       </w:r>
       <w:r>
         <w:t xml:space="preserve"> </w:t>
@@ -6145,7 +5854,7 @@
         <w:pStyle w:val="BodyText"/>
       </w:pPr>
       <w:r>
-        <w:t xml:space="preserve">#mmkuvfatqx .gt_row_group_first td {</w:t>
+        <w:t xml:space="preserve">#nglwkjudzt .gt_row_group_first td {</w:t>
       </w:r>
       <w:r>
         <w:t xml:space="preserve"> </w:t>
@@ -6165,7 +5874,7 @@
         <w:pStyle w:val="BodyText"/>
       </w:pPr>
       <w:r>
-        <w:t xml:space="preserve">#mmkuvfatqx .gt_row_group_first th {</w:t>
+        <w:t xml:space="preserve">#nglwkjudzt .gt_row_group_first th {</w:t>
       </w:r>
       <w:r>
         <w:t xml:space="preserve"> </w:t>
@@ -6185,7 +5894,7 @@
         <w:pStyle w:val="BodyText"/>
       </w:pPr>
       <w:r>
-        <w:t xml:space="preserve">#mmkuvfatqx .gt_summary_row {</w:t>
+        <w:t xml:space="preserve">#nglwkjudzt .gt_summary_row {</w:t>
       </w:r>
       <w:r>
         <w:t xml:space="preserve"> </w:t>
@@ -6241,7 +5950,7 @@
         <w:pStyle w:val="BodyText"/>
       </w:pPr>
       <w:r>
-        <w:t xml:space="preserve">#mmkuvfatqx .gt_first_summary_row {</w:t>
+        <w:t xml:space="preserve">#nglwkjudzt .gt_first_summary_row {</w:t>
       </w:r>
       <w:r>
         <w:t xml:space="preserve"> </w:t>
@@ -6267,7 +5976,7 @@
         <w:pStyle w:val="BodyText"/>
       </w:pPr>
       <w:r>
-        <w:t xml:space="preserve">#mmkuvfatqx .gt_first_summary_row.thick {</w:t>
+        <w:t xml:space="preserve">#nglwkjudzt .gt_first_summary_row.thick {</w:t>
       </w:r>
       <w:r>
         <w:t xml:space="preserve"> </w:t>
@@ -6287,7 +5996,7 @@
         <w:pStyle w:val="BodyText"/>
       </w:pPr>
       <w:r>
-        <w:t xml:space="preserve">#mmkuvfatqx .gt_last_summary_row {</w:t>
+        <w:t xml:space="preserve">#nglwkjudzt .gt_last_summary_row {</w:t>
       </w:r>
       <w:r>
         <w:t xml:space="preserve"> </w:t>
@@ -6343,7 +6052,7 @@
         <w:pStyle w:val="BodyText"/>
       </w:pPr>
       <w:r>
-        <w:t xml:space="preserve">#mmkuvfatqx .gt_grand_summary_row {</w:t>
+        <w:t xml:space="preserve">#nglwkjudzt .gt_grand_summary_row {</w:t>
       </w:r>
       <w:r>
         <w:t xml:space="preserve"> </w:t>
@@ -6399,7 +6108,7 @@
         <w:pStyle w:val="BodyText"/>
       </w:pPr>
       <w:r>
-        <w:t xml:space="preserve">#mmkuvfatqx .gt_first_grand_summary_row {</w:t>
+        <w:t xml:space="preserve">#nglwkjudzt .gt_first_grand_summary_row {</w:t>
       </w:r>
       <w:r>
         <w:t xml:space="preserve"> </w:t>
@@ -6455,7 +6164,7 @@
         <w:pStyle w:val="BodyText"/>
       </w:pPr>
       <w:r>
-        <w:t xml:space="preserve">#mmkuvfatqx .gt_last_grand_summary_row_top {</w:t>
+        <w:t xml:space="preserve">#nglwkjudzt .gt_last_grand_summary_row_top {</w:t>
       </w:r>
       <w:r>
         <w:t xml:space="preserve"> </w:t>
@@ -6511,7 +6220,7 @@
         <w:pStyle w:val="BodyText"/>
       </w:pPr>
       <w:r>
-        <w:t xml:space="preserve">#mmkuvfatqx .gt_striped {</w:t>
+        <w:t xml:space="preserve">#nglwkjudzt .gt_striped {</w:t>
       </w:r>
       <w:r>
         <w:t xml:space="preserve"> </w:t>
@@ -6531,7 +6240,7 @@
         <w:pStyle w:val="BodyText"/>
       </w:pPr>
       <w:r>
-        <w:t xml:space="preserve">#mmkuvfatqx .gt_table_body {</w:t>
+        <w:t xml:space="preserve">#nglwkjudzt .gt_table_body {</w:t>
       </w:r>
       <w:r>
         <w:t xml:space="preserve"> </w:t>
@@ -6581,7 +6290,7 @@
         <w:pStyle w:val="BodyText"/>
       </w:pPr>
       <w:r>
-        <w:t xml:space="preserve">#mmkuvfatqx .gt_footnotes {</w:t>
+        <w:t xml:space="preserve">#nglwkjudzt .gt_footnotes {</w:t>
       </w:r>
       <w:r>
         <w:t xml:space="preserve"> </w:t>
@@ -6661,7 +6370,7 @@
         <w:pStyle w:val="BodyText"/>
       </w:pPr>
       <w:r>
-        <w:t xml:space="preserve">#mmkuvfatqx .gt_footnote {</w:t>
+        <w:t xml:space="preserve">#nglwkjudzt .gt_footnote {</w:t>
       </w:r>
       <w:r>
         <w:t xml:space="preserve"> </w:t>
@@ -6711,7 +6420,7 @@
         <w:pStyle w:val="BodyText"/>
       </w:pPr>
       <w:r>
-        <w:t xml:space="preserve">#mmkuvfatqx .gt_sourcenotes {</w:t>
+        <w:t xml:space="preserve">#nglwkjudzt .gt_sourcenotes {</w:t>
       </w:r>
       <w:r>
         <w:t xml:space="preserve"> </w:t>
@@ -6791,7 +6500,7 @@
         <w:pStyle w:val="BodyText"/>
       </w:pPr>
       <w:r>
-        <w:t xml:space="preserve">#mmkuvfatqx .gt_sourcenote {</w:t>
+        <w:t xml:space="preserve">#nglwkjudzt .gt_sourcenote {</w:t>
       </w:r>
       <w:r>
         <w:t xml:space="preserve"> </w:t>
@@ -6835,7 +6544,7 @@
         <w:pStyle w:val="BodyText"/>
       </w:pPr>
       <w:r>
-        <w:t xml:space="preserve">#mmkuvfatqx .gt_left {</w:t>
+        <w:t xml:space="preserve">#nglwkjudzt .gt_left {</w:t>
       </w:r>
       <w:r>
         <w:t xml:space="preserve"> </w:t>
@@ -6855,7 +6564,7 @@
         <w:pStyle w:val="BodyText"/>
       </w:pPr>
       <w:r>
-        <w:t xml:space="preserve">#mmkuvfatqx .gt_center {</w:t>
+        <w:t xml:space="preserve">#nglwkjudzt .gt_center {</w:t>
       </w:r>
       <w:r>
         <w:t xml:space="preserve"> </w:t>
@@ -6875,7 +6584,7 @@
         <w:pStyle w:val="BodyText"/>
       </w:pPr>
       <w:r>
-        <w:t xml:space="preserve">#mmkuvfatqx .gt_right {</w:t>
+        <w:t xml:space="preserve">#nglwkjudzt .gt_right {</w:t>
       </w:r>
       <w:r>
         <w:t xml:space="preserve"> </w:t>
@@ -6901,7 +6610,7 @@
         <w:pStyle w:val="BodyText"/>
       </w:pPr>
       <w:r>
-        <w:t xml:space="preserve">#mmkuvfatqx .gt_font_normal {</w:t>
+        <w:t xml:space="preserve">#nglwkjudzt .gt_font_normal {</w:t>
       </w:r>
       <w:r>
         <w:t xml:space="preserve"> </w:t>
@@ -6921,7 +6630,7 @@
         <w:pStyle w:val="BodyText"/>
       </w:pPr>
       <w:r>
-        <w:t xml:space="preserve">#mmkuvfatqx .gt_font_bold {</w:t>
+        <w:t xml:space="preserve">#nglwkjudzt .gt_font_bold {</w:t>
       </w:r>
       <w:r>
         <w:t xml:space="preserve"> </w:t>
@@ -6941,7 +6650,7 @@
         <w:pStyle w:val="BodyText"/>
       </w:pPr>
       <w:r>
-        <w:t xml:space="preserve">#mmkuvfatqx .gt_font_italic {</w:t>
+        <w:t xml:space="preserve">#nglwkjudzt .gt_font_italic {</w:t>
       </w:r>
       <w:r>
         <w:t xml:space="preserve"> </w:t>
@@ -6961,7 +6670,7 @@
         <w:pStyle w:val="BodyText"/>
       </w:pPr>
       <w:r>
-        <w:t xml:space="preserve">#mmkuvfatqx .gt_super {</w:t>
+        <w:t xml:space="preserve">#nglwkjudzt .gt_super {</w:t>
       </w:r>
       <w:r>
         <w:t xml:space="preserve"> </w:t>
@@ -6981,7 +6690,7 @@
         <w:pStyle w:val="BodyText"/>
       </w:pPr>
       <w:r>
-        <w:t xml:space="preserve">#mmkuvfatqx .gt_footnote_marks {</w:t>
+        <w:t xml:space="preserve">#nglwkjudzt .gt_footnote_marks {</w:t>
       </w:r>
       <w:r>
         <w:t xml:space="preserve"> </w:t>
@@ -7013,7 +6722,7 @@
         <w:pStyle w:val="BodyText"/>
       </w:pPr>
       <w:r>
-        <w:t xml:space="preserve">#mmkuvfatqx .gt_asterisk {</w:t>
+        <w:t xml:space="preserve">#nglwkjudzt .gt_asterisk {</w:t>
       </w:r>
       <w:r>
         <w:t xml:space="preserve"> </w:t>
@@ -7039,7 +6748,7 @@
         <w:pStyle w:val="BodyText"/>
       </w:pPr>
       <w:r>
-        <w:t xml:space="preserve">#mmkuvfatqx .gt_indent_1 {</w:t>
+        <w:t xml:space="preserve">#nglwkjudzt .gt_indent_1 {</w:t>
       </w:r>
       <w:r>
         <w:t xml:space="preserve"> </w:t>
@@ -7059,7 +6768,7 @@
         <w:pStyle w:val="BodyText"/>
       </w:pPr>
       <w:r>
-        <w:t xml:space="preserve">#mmkuvfatqx .gt_indent_2 {</w:t>
+        <w:t xml:space="preserve">#nglwkjudzt .gt_indent_2 {</w:t>
       </w:r>
       <w:r>
         <w:t xml:space="preserve"> </w:t>
@@ -7079,7 +6788,7 @@
         <w:pStyle w:val="BodyText"/>
       </w:pPr>
       <w:r>
-        <w:t xml:space="preserve">#mmkuvfatqx .gt_indent_3 {</w:t>
+        <w:t xml:space="preserve">#nglwkjudzt .gt_indent_3 {</w:t>
       </w:r>
       <w:r>
         <w:t xml:space="preserve"> </w:t>
@@ -7099,7 +6808,7 @@
         <w:pStyle w:val="BodyText"/>
       </w:pPr>
       <w:r>
-        <w:t xml:space="preserve">#mmkuvfatqx .gt_indent_4 {</w:t>
+        <w:t xml:space="preserve">#nglwkjudzt .gt_indent_4 {</w:t>
       </w:r>
       <w:r>
         <w:t xml:space="preserve"> </w:t>
@@ -7119,7 +6828,7 @@
         <w:pStyle w:val="BodyText"/>
       </w:pPr>
       <w:r>
-        <w:t xml:space="preserve">#mmkuvfatqx .gt_indent_5 {</w:t>
+        <w:t xml:space="preserve">#nglwkjudzt .gt_indent_5 {</w:t>
       </w:r>
       <w:r>
         <w:t xml:space="preserve"> </w:t>
@@ -7139,7 +6848,7 @@
         <w:pStyle w:val="BodyText"/>
       </w:pPr>
       <w:r>
-        <w:t xml:space="preserve">#mmkuvfatqx .katex-display {</w:t>
+        <w:t xml:space="preserve">#nglwkjudzt .katex-display {</w:t>
       </w:r>
       <w:r>
         <w:t xml:space="preserve"> </w:t>
@@ -7165,7 +6874,7 @@
         <w:pStyle w:val="BodyText"/>
       </w:pPr>
       <w:r>
-        <w:t xml:space="preserve">#mmkuvfatqx div.Reactable &gt; div.rt-table &gt; div.rt-thead &gt; div.rt-tr.rt-tr-group-header &gt; div.rt-th-group:after {</w:t>
+        <w:t xml:space="preserve">#nglwkjudzt div.Reactable &gt; div.rt-table &gt; div.rt-thead &gt; div.rt-tr.rt-tr-group-header &gt; div.rt-th-group:after {</w:t>
       </w:r>
       <w:r>
         <w:t xml:space="preserve"> </w:t>
@@ -8684,7 +8393,7 @@
         <w:t xml:space="preserve">Abbreviations: CI = Confidence Interval, OR = Odds Ratio</w:t>
       </w:r>
     </w:p>
-    <w:bookmarkStart w:id="38" w:name="participants-1"/>
+    <w:bookmarkStart w:id="41" w:name="participants-1"/>
     <w:p>
       <w:pPr>
         <w:pStyle w:val="Heading2"/>
@@ -8698,55 +8407,7 @@
         <w:pStyle w:val="FirstParagraph"/>
       </w:pPr>
       <w:r>
-        <w:t xml:space="preserve">There was a total of 14022 patients in the trauma registry. After</w:t>
-      </w:r>
-      <w:r>
-        <w:t xml:space="preserve"> </w:t>
-      </w:r>
-      <w:r>
-        <w:t xml:space="preserve">excluding the patients younger than 15 and/or were dead on arrival,</w:t>
-      </w:r>
-      <w:r>
-        <w:t xml:space="preserve"> </w:t>
-      </w:r>
-      <w:r>
-        <w:t xml:space="preserve">there were 12153 patients remaining. Out of those, 7152 patients had</w:t>
-      </w:r>
-      <w:r>
-        <w:t xml:space="preserve"> </w:t>
-      </w:r>
-      <w:r>
-        <w:t xml:space="preserve">been reviewed for the presence of OFI. A total of 2233 patients were</w:t>
-      </w:r>
-      <w:r>
-        <w:t xml:space="preserve"> </w:t>
-      </w:r>
-      <w:r>
-        <w:t xml:space="preserve">excluded due to missing data, resulting in 4919 patients for the final</w:t>
-      </w:r>
-      <w:r>
-        <w:t xml:space="preserve"> </w:t>
-      </w:r>
-      <w:r>
-        <w:t xml:space="preserve">analysis. The selection process is shown in Figure 1. The variable with</w:t>
-      </w:r>
-      <w:r>
-        <w:t xml:space="preserve"> </w:t>
-      </w:r>
-      <w:r>
-        <w:t xml:space="preserve">the most missing data is BE, for which data was missing in 1721</w:t>
-      </w:r>
-      <w:r>
-        <w:t xml:space="preserve"> </w:t>
-      </w:r>
-      <w:r>
-        <w:t xml:space="preserve">patients. Detailed data regarding missing data is displayed in the</w:t>
-      </w:r>
-      <w:r>
-        <w:t xml:space="preserve"> </w:t>
-      </w:r>
-      <w:r>
-        <w:t xml:space="preserve">supplementary material.</w:t>
+        <w:t xml:space="preserve">There were a total of 14,022 patients in the trauma registry. After excluding the patients younger than 15 and those who were dead on arrival, there were 12,153 patients remaining. Out of those, 7152 patients had been reviewed for the presence of OFI. A total of 2233 patients were excluded due to missing data, resulting in 4919 patients for the final analysis. The selection process is shown in Figure 1. The variable with the most missing data is BE, for which data was missing in 1721 patients. Detailed data regarding missing data is available in the supplementary material.</w:t>
       </w:r>
     </w:p>
     <w:p>
@@ -8757,8 +8418,8 @@
         <w:t xml:space="preserve">Figure 1. Flowchart of selection of study population.</w:t>
       </w:r>
     </w:p>
-    <w:bookmarkEnd w:id="38"/>
-    <w:bookmarkStart w:id="39" w:name="descriptive-data"/>
+    <w:bookmarkEnd w:id="41"/>
+    <w:bookmarkStart w:id="42" w:name="descriptive-data"/>
     <w:p>
       <w:pPr>
         <w:pStyle w:val="Heading2"/>
@@ -8772,25 +8433,7 @@
         <w:pStyle w:val="FirstParagraph"/>
       </w:pPr>
       <w:r>
-        <w:t xml:space="preserve">Descriptive data is shown in Table 3. The median age was 39 years (25,</w:t>
-      </w:r>
-      <w:r>
-        <w:t xml:space="preserve"> </w:t>
-      </w:r>
-      <w:r>
-        <w:t xml:space="preserve">56), and 3506 (71%) of the individuals were males. Clinically, the</w:t>
-      </w:r>
-      <w:r>
-        <w:t xml:space="preserve"> </w:t>
-      </w:r>
-      <w:r>
-        <w:t xml:space="preserve">median ISS was 5, which is considered minor injuries, and the median INR</w:t>
-      </w:r>
-      <w:r>
-        <w:t xml:space="preserve"> </w:t>
-      </w:r>
-      <w:r>
-        <w:t xml:space="preserve">was 1.00, and the most common Preinjury ASA class was 1, at 62%.</w:t>
+        <w:t xml:space="preserve">Descriptive data is shown in Table 3. The median age was 39 years (IQR 25, 56), and 3506 (71%) of the individuals were males. The median ISS was 5 (IQR 1, 14), which is considered minor trauma, the median INR was 1.00 (IQR 1.00, 1.10), and the most common Preinjury ASA class was 1 (62%).</w:t>
       </w:r>
     </w:p>
     <w:p>
@@ -8798,31 +8441,7 @@
         <w:pStyle w:val="BodyText"/>
       </w:pPr>
       <w:r>
-        <w:t xml:space="preserve">Overall, 3989 (81%) of the patients were classified as having no shock</w:t>
-      </w:r>
-      <w:r>
-        <w:t xml:space="preserve"> </w:t>
-      </w:r>
-      <w:r>
-        <w:t xml:space="preserve">(class 1) according to the BE classification, the sum of the remaining</w:t>
-      </w:r>
-      <w:r>
-        <w:t xml:space="preserve"> </w:t>
-      </w:r>
-      <w:r>
-        <w:t xml:space="preserve">classes accounted for 930 (19%) patients. The distribution of the</w:t>
-      </w:r>
-      <w:r>
-        <w:t xml:space="preserve"> </w:t>
-      </w:r>
-      <w:r>
-        <w:t xml:space="preserve">classes was decreasing in numbers with increased severity, with class 2:</w:t>
-      </w:r>
-      <w:r>
-        <w:t xml:space="preserve"> </w:t>
-      </w:r>
-      <w:r>
-        <w:t xml:space="preserve">644 (13%), class 3: 170 (3.5%), and class 4: 116 (2.4%).</w:t>
+        <w:t xml:space="preserve">According to the BE classification, 3989 (81%) of the patients were classified as having no shock (class 1). The distribution of the remaining classes was decreasing in numbers with increased severity, with class 2: 644 (13%), class 3: 170 (3.5%), and class 4: 116 (2.4%).</w:t>
       </w:r>
     </w:p>
     <w:p>
@@ -8830,31 +8449,7 @@
         <w:pStyle w:val="BodyText"/>
       </w:pPr>
       <w:r>
-        <w:t xml:space="preserve">According to SBP, 4455 (91%) patients had no shock (class 1), while the</w:t>
-      </w:r>
-      <w:r>
-        <w:t xml:space="preserve"> </w:t>
-      </w:r>
-      <w:r>
-        <w:t xml:space="preserve">remaining classes with patients in shock accounted for 464 (9%) of all</w:t>
-      </w:r>
-      <w:r>
-        <w:t xml:space="preserve"> </w:t>
-      </w:r>
-      <w:r>
-        <w:t xml:space="preserve">the patients. Among the classes defined with shock, class 2 was the</w:t>
-      </w:r>
-      <w:r>
-        <w:t xml:space="preserve"> </w:t>
-      </w:r>
-      <w:r>
-        <w:t xml:space="preserve">biggest at 239 (4.9%), followed by class 4 at 127 (2.6%), and lastly</w:t>
-      </w:r>
-      <w:r>
-        <w:t xml:space="preserve"> </w:t>
-      </w:r>
-      <w:r>
-        <w:t xml:space="preserve">class 3 with 99 (2.0%).</w:t>
+        <w:t xml:space="preserve">According to SBP classification, 4455 (91%) patients had no shock (class 1). The distribution of the remaining classes, in the order of most to least common, was: class 2 at 239 (4.9%), followed by class 4 at 127 (2.6%), and lastly class 3 with 99 (2.0%).</w:t>
       </w:r>
     </w:p>
     <w:p>
@@ -13539,8 +13134,8 @@
         </w:tc>
       </w:tr>
     </w:tbl>
-    <w:bookmarkEnd w:id="39"/>
-    <w:bookmarkStart w:id="40" w:name="outcome-data"/>
+    <w:bookmarkEnd w:id="42"/>
+    <w:bookmarkStart w:id="43" w:name="outcome-data"/>
     <w:p>
       <w:pPr>
         <w:pStyle w:val="Heading2"/>
@@ -13554,58 +13149,7 @@
         <w:pStyle w:val="FirstParagraph"/>
       </w:pPr>
       <w:r>
-        <w:t xml:space="preserve">Out of the 4919 patients reviewed without missing data, 281 (5.7%)</w:t>
-      </w:r>
-      <w:r>
-        <w:t xml:space="preserve"> </w:t>
-      </w:r>
-      <w:r>
-        <w:t xml:space="preserve">patients had at least one OFI. The most common OFI type was clinical</w:t>
-      </w:r>
-      <w:r>
-        <w:t xml:space="preserve"> </w:t>
-      </w:r>
-      <w:r>
-        <w:t xml:space="preserve">judgment error, numbering 103 (37%) patients. The other three major OFI</w:t>
-      </w:r>
-      <w:r>
-        <w:t xml:space="preserve"> </w:t>
-      </w:r>
-      <w:r>
-        <w:t xml:space="preserve">types were inadequate resources for 61 (22%) patients, delay in</w:t>
-      </w:r>
-      <w:r>
-        <w:t xml:space="preserve"> </w:t>
-      </w:r>
-      <w:r>
-        <w:t xml:space="preserve">treatment for 49 (17%) patients, and missed diagnosis for 48 (17%)</w:t>
-      </w:r>
-      <w:r>
-        <w:t xml:space="preserve"> </w:t>
-      </w:r>
-      <w:r>
-        <w:t xml:space="preserve">patients. The least common OFI was</w:t>
-      </w:r>
-      <w:r>
-        <w:t xml:space="preserve"> </w:t>
-      </w:r>
-      <w:r>
-        <w:t xml:space="preserve">“</w:t>
-      </w:r>
-      <w:r>
-        <w:t xml:space="preserve">other errors</w:t>
-      </w:r>
-      <w:r>
-        <w:t xml:space="preserve">”</w:t>
-      </w:r>
-      <w:r>
-        <w:t xml:space="preserve">, which was present in</w:t>
-      </w:r>
-      <w:r>
-        <w:t xml:space="preserve"> </w:t>
-      </w:r>
-      <w:r>
-        <w:t xml:space="preserve">5 (1.8%) patients.</w:t>
+        <w:t xml:space="preserve">Out of the 4919 reviewed patients with complete data, 281 (5.7%) patients had at least one OFI. The most common OFI type was clinical judgment error, which was present in the care of 103 (37%) patients. The other three major OFI types were inadequate resources for 61 (22%) patients, delay in treatment for 49 (17%) patients, and missed diagnosis for 48 (17%) patients. The least common OFI was other errors, which was present in 5 (1.8%) patients.</w:t>
       </w:r>
     </w:p>
     <w:p>
@@ -13613,55 +13157,7 @@
         <w:pStyle w:val="BodyText"/>
       </w:pPr>
       <w:r>
-        <w:t xml:space="preserve">The most common OFI in patients without chock (class 1) was clinical</w:t>
-      </w:r>
-      <w:r>
-        <w:t xml:space="preserve"> </w:t>
-      </w:r>
-      <w:r>
-        <w:t xml:space="preserve">judgment error both in the BE and SBP groups, while the other OFI types</w:t>
-      </w:r>
-      <w:r>
-        <w:t xml:space="preserve"> </w:t>
-      </w:r>
-      <w:r>
-        <w:t xml:space="preserve">also followed a similar distribution between the groups. Clinical</w:t>
-      </w:r>
-      <w:r>
-        <w:t xml:space="preserve"> </w:t>
-      </w:r>
-      <w:r>
-        <w:t xml:space="preserve">judgment error was the most common OFI in the BE group class 2, 3 and 4,</w:t>
-      </w:r>
-      <w:r>
-        <w:t xml:space="preserve"> </w:t>
-      </w:r>
-      <w:r>
-        <w:t xml:space="preserve">at 34.6%; 31.2%; and 42.9% respectively. On the other hand, the largest</w:t>
-      </w:r>
-      <w:r>
-        <w:t xml:space="preserve"> </w:t>
-      </w:r>
-      <w:r>
-        <w:t xml:space="preserve">OFI type in SBP class 2 was delay in treatment at 50%. The frequencies</w:t>
-      </w:r>
-      <w:r>
-        <w:t xml:space="preserve"> </w:t>
-      </w:r>
-      <w:r>
-        <w:t xml:space="preserve">of clinical judgement error and missed diagnosis were similar in the SBP</w:t>
-      </w:r>
-      <w:r>
-        <w:t xml:space="preserve"> </w:t>
-      </w:r>
-      <w:r>
-        <w:t xml:space="preserve">class 3 group, at 40% each. Lastly, the most common OFI in class 4 of</w:t>
-      </w:r>
-      <w:r>
-        <w:t xml:space="preserve"> </w:t>
-      </w:r>
-      <w:r>
-        <w:t xml:space="preserve">the SBP group was clinical judgment error, at 46.7%.</w:t>
+        <w:t xml:space="preserve">The most common OFI in patients without chock (class 1) was clinical judgment error both in the BE and SBP groups. The other OFI types also followed a similar distribution in the two groups. Clinical judgment error was the most common OFI in the BE group class 2, 3 and 4, at 34.6%; 31.2%; and 42.9% respectively. On the other hand, the largest OFI type in SBP class 2 was delay in treatment at 50%. The frequencies of clinical judgement error and missed diagnosis were similar in the SBP class 3 group, at 40% each. Lastly, the most common OFI in class 4 of the SBP group was clinical judgment error, at 46.7%.</w:t>
       </w:r>
     </w:p>
     <w:p>
@@ -16763,8 +16259,8 @@
         </w:tc>
       </w:tr>
     </w:tbl>
-    <w:bookmarkEnd w:id="40"/>
-    <w:bookmarkStart w:id="41" w:name="main-results"/>
+    <w:bookmarkEnd w:id="43"/>
+    <w:bookmarkStart w:id="44" w:name="main-results"/>
     <w:p>
       <w:pPr>
         <w:pStyle w:val="Heading2"/>
@@ -16786,15 +16282,13 @@
         <w:pStyle w:val="BodyText"/>
       </w:pPr>
       <w:r>
-        <w:t xml:space="preserve">The adjusted analysis was conducted in two steps. In the first step, we adjusted for age, gender, preinjury ASA score, and INR, but not for ISS. Compared to the unadjusted analysis, this initial adjustment led to minor changes in ORs. In the BE group, the OR for class 2 changed by approximately 1% (from 1.61 to 1.60), and for class 3, it changed by about 2% (from 1.91 to 1.93), as shown in Table 6. In the SBP group, the OR for class 4 changed by around 7% (from 2.28 to 2.21), as shown in Table 7.</w:t>
-      </w:r>
-    </w:p>
-    <w:p>
-      <w:pPr>
-        <w:pStyle w:val="BodyText"/>
-      </w:pPr>
-      <w:r>
-        <w:t xml:space="preserve">In the second step, ISS was added to the adjustment model to complete the fully adjusted model. For the BE group (Table 6), this led to a shift in statistical significance: instead of class 2 and 3, class 4 became statistically significant. In this fully adjusted model, class 4 was associated with 63% lower odds of an opportunity for improvement (OR 0.37, 95% CI 0.14–0.83, p = 0.026). In contrast, for the SBP group (Table 7), no class remained statistically significant in the fully adjusted model.</w:t>
+        <w:t xml:space="preserve">The adjusted analysis was conducted in two steps. In the first step, we adjusted for age, gender, preinjury ASA score, and INR, but not for ISS. Compared to the unadjusted analysis, this initial adjustment led to minor changes in ORs, as shown in Table 7.</w:t>
+      </w:r>
+      <w:r>
+        <w:t xml:space="preserve"> </w:t>
+      </w:r>
+      <w:r>
+        <w:t xml:space="preserve">In the second step, we also adjusted for ISS. For the BE group (Table 6), this led to a shift in statistical significance: instead of class 2 and 3, class 4 became statistically significant. In this fully adjusted model, class 4 was associated with 63% lower odds of an opportunity for improvement (OR 0.37, 95% CI 0.14–0.83, p = 0.026). In contrast, for the SBP group (Table 7), no class remained statistically significant in the fully adjusted model.</w:t>
       </w:r>
     </w:p>
     <w:p>
@@ -27819,8 +27313,8 @@
         </w:tc>
       </w:tr>
     </w:tbl>
-    <w:bookmarkEnd w:id="41"/>
-    <w:bookmarkStart w:id="46" w:name="discussion"/>
+    <w:bookmarkEnd w:id="44"/>
+    <w:bookmarkStart w:id="49" w:name="discussion"/>
     <w:p>
       <w:pPr>
         <w:pStyle w:val="Heading1"/>
@@ -27829,7 +27323,7 @@
         <w:t xml:space="preserve">Discussion</w:t>
       </w:r>
     </w:p>
-    <w:bookmarkStart w:id="42" w:name="key-results"/>
+    <w:bookmarkStart w:id="45" w:name="key-results"/>
     <w:p>
       <w:pPr>
         <w:pStyle w:val="Heading2"/>
@@ -27843,11 +27337,11 @@
         <w:pStyle w:val="FirstParagraph"/>
       </w:pPr>
       <w:r>
-        <w:t xml:space="preserve">We found that the most common type of OFI is clinical judgment error across almost all shock severities. The unadjusted models suggested a positive association between moderate shock and OFI; adjustment reversed this, with severe shock showing 63% reduced odds.</w:t>
-      </w:r>
-    </w:p>
-    <w:bookmarkEnd w:id="42"/>
-    <w:bookmarkStart w:id="43" w:name="limitations"/>
+        <w:t xml:space="preserve">We found that the most common type of OFI is clinical judgment error across all shock severities for BE classification. The SBP classification was also dominated by clinical judgement errors but, varied with delay in treatment being major one in mild shock class. The unadjusted BE model suggested there is higher odds of OFI for the mild shock class (class 2), while the SBP model suggested higher odds of OFI in the severe class (class 4). Adjustment with other factors showed minimal changes, whereas adjustment with ISS reversed the association to the negative for the severe class (class 4) of BE model. This trend was also observed for other BE and SBP classes, but they lacked statistical significance.</w:t>
+      </w:r>
+    </w:p>
+    <w:bookmarkEnd w:id="45"/>
+    <w:bookmarkStart w:id="46" w:name="limitations"/>
     <w:p>
       <w:pPr>
         <w:pStyle w:val="Heading2"/>
@@ -27861,7 +27355,7 @@
         <w:pStyle w:val="FirstParagraph"/>
       </w:pPr>
       <w:r>
-        <w:t xml:space="preserve">The study design is limited by the lack of data on heart rate, FAST, detailed types of injury, and clinical chemistry. This resulted in choosing a proprietary simplified ATLS framework instead of categorizations such as TASH, TBSS, and ABC with better sensitivity and specificity than the ATLS framework</w:t>
+        <w:t xml:space="preserve">The main limitation was that we could not use a shock classification with better discrimination such as TASH, TBSS or ABC</w:t>
       </w:r>
       <w:r>
         <w:t xml:space="preserve"> </w:t>
@@ -27870,11 +27364,11 @@
         <w:t xml:space="preserve">(14–16)</w:t>
       </w:r>
       <w:r>
-        <w:t xml:space="preserve">. Another limitation is that missing data were handled by listwise deletion, which reduced the sample size by 2233 and may also introduce bias due to missing BE values. Also worth noting is that the sample size for most of the shock classes (class 2 to 4) are roughly around 100 to 200 patients, whereas those with positive OFI are as low as five patients. This may have resulted in higher randomness and inflated effect sizes.</w:t>
-      </w:r>
-    </w:p>
-    <w:bookmarkEnd w:id="43"/>
-    <w:bookmarkStart w:id="45" w:name="interpretation"/>
+        <w:t xml:space="preserve">, because the required variables were not available in the registry. This resulted in proprietary simplified ATLS framework. Another limitation was missing data, which is unfortunately common in registries. Also worth noting is that the sample size for most of the shock classes (class 2 to 4) are roughly around 100 to 200 patients, whereas those with positive OFI are as low as five patients. This may have resulted in inflated effect sizes.</w:t>
+      </w:r>
+    </w:p>
+    <w:bookmarkEnd w:id="46"/>
+    <w:bookmarkStart w:id="48" w:name="interpretation"/>
     <w:p>
       <w:pPr>
         <w:pStyle w:val="Heading2"/>
@@ -27888,7 +27382,75 @@
         <w:pStyle w:val="FirstParagraph"/>
       </w:pPr>
       <w:r>
-        <w:t xml:space="preserve">The lower odds of OFI for patients with BE &lt; -10 may be explained by two theories. One is that more severe injuries may receive heightened attention and more protocol-driven responses. This would in turn, result in reduced risk of deviation from optimal care (and thus OFIs). This theory is also partly supported by the observation that the OFIs</w:t>
+        <w:t xml:space="preserve">The results from the unadjusted regression model, suggest that we are more prone to errors when patients SBP drops below 90mmhg or mild BE drop between -2 to -6, when only assessing the physiological parameters. This affirms the common usage of 90mmHg as a lower SBP limit. Secondly this also suggest higher risk for errors during clinically ambiguate BE parameters, where the decision of next step such as triage, diagnostics or calling for extra resources or personal aren’t clear. This will be further discussed with the different OFI types in the comparison to other studies.</w:t>
+      </w:r>
+    </w:p>
+    <w:p>
+      <w:pPr>
+        <w:pStyle w:val="BodyText"/>
+      </w:pPr>
+      <w:r>
+        <w:t xml:space="preserve">The adjusted model differed substantially from the unadjusted model. After inclusion of ISS, the positive association between shock severity and OFI disappeared, and patients with BE &lt; -10 (class 4) instead showed lower odds of OFI. This marked change suggests that ISS strongly influences the observed relationship between shock severity and OFI. One explanation may be multicollinearity, as both BE and ISS reflect injury severity and the anatomical injury, bleeding, and physiological response are closely interconnected. A correlation between ISS and BD (inverted BE) or SBP has also been demonstrated by Mutschler et al.</w:t>
+      </w:r>
+      <w:r>
+        <w:t xml:space="preserve"> </w:t>
+      </w:r>
+      <w:r>
+        <w:t xml:space="preserve">(12,13)</w:t>
+      </w:r>
+      <w:r>
+        <w:t xml:space="preserve">. Consequently, adjusting for both variables simultaneously may produce estimates that are difficult to interpret and may explain the reversal of odds ratios and the redistribution of statistically significant classes.</w:t>
+      </w:r>
+    </w:p>
+    <w:p>
+      <w:pPr>
+        <w:pStyle w:val="BodyText"/>
+      </w:pPr>
+      <w:r>
+        <w:t xml:space="preserve">Another contributing factor may be the modelling of ISS as a continuous (linear) variable. As shown by Albaaj et al.</w:t>
+      </w:r>
+      <w:r>
+        <w:t xml:space="preserve"> </w:t>
+      </w:r>
+      <w:r>
+        <w:t xml:space="preserve">(17)</w:t>
+      </w:r>
+      <w:r>
+        <w:t xml:space="preserve">, increases in ISS do not correspond proportionally to increases in the likelihood of OFI, suggesting that the relationship between ISS and OFI is non-linear. Assuming a linear relationship may therefore have influenced the adjusted estimates and the distribution of statistically significant classes.</w:t>
+      </w:r>
+    </w:p>
+    <w:p>
+      <w:pPr>
+        <w:pStyle w:val="BodyText"/>
+      </w:pPr>
+      <w:r>
+        <w:t xml:space="preserve">Despite these statistical explanations, the inverse association observed for patients with BE &lt; -10 may also reflect a true clinical phenomenon. Among patients with similar anatomical injury severity, those with more severe physiological shock may receive heightened clinical attention and more protocol-driven management. This could reduce deviations from optimal care and consequently the occurrence of OFIs. This hypothesis is partly supported by the lower frequency of OFI types such as inadequate resources and delay in treatment with increasing shock severity. However, this explanation remains speculative, and future studies should investigate whether specific OFI categories vary according to shock severity using regression analyses.</w:t>
+      </w:r>
+    </w:p>
+    <w:bookmarkStart w:id="47" w:name="comparison-to-literature"/>
+    <w:p>
+      <w:pPr>
+        <w:pStyle w:val="Heading3"/>
+      </w:pPr>
+      <w:r>
+        <w:t xml:space="preserve">Comparison to literature</w:t>
+      </w:r>
+    </w:p>
+    <w:p>
+      <w:pPr>
+        <w:pStyle w:val="FirstParagraph"/>
+      </w:pPr>
+      <w:r>
+        <w:t xml:space="preserve">A previous study by O’Reilly et al</w:t>
+      </w:r>
+      <w:r>
+        <w:t xml:space="preserve"> </w:t>
+      </w:r>
+      <w:r>
+        <w:t xml:space="preserve">(8)</w:t>
+      </w:r>
+      <w:r>
+        <w:t xml:space="preserve">, which looked into opportunities for performance improvements (OPI) in 7511 cases, whereof 127 patients whose death was affected by hemorrhage, found that the most common OPI was related to decision making (63 out of 150 OPIs). This aligns with our findings that</w:t>
       </w:r>
       <w:r>
         <w:t xml:space="preserve"> </w:t>
@@ -27897,7 +27459,7 @@
         <w:t xml:space="preserve">“</w:t>
       </w:r>
       <w:r>
-        <w:t xml:space="preserve">inadequate protocols</w:t>
+        <w:t xml:space="preserve">clinical judgment error</w:t>
       </w:r>
       <w:r>
         <w:t xml:space="preserve">”</w:t>
@@ -27906,7 +27468,27 @@
         <w:t xml:space="preserve"> </w:t>
       </w:r>
       <w:r>
-        <w:t xml:space="preserve">and</w:t>
+        <w:t xml:space="preserve">was the most common OFI for all patients and patients in shock. While clinical judgment error is most common across nearly all severities for both BE and SBP models, there is the exception of delay in treatment being more common in class 2 of SBP model</w:t>
+      </w:r>
+    </w:p>
+    <w:p>
+      <w:pPr>
+        <w:pStyle w:val="BodyText"/>
+      </w:pPr>
+      <w:r>
+        <w:t xml:space="preserve">No studies were found that specifically examined OFIs in patients in shock, but studies on OFIs in general trauma populations show results in a similar theme. A study by T.P. Saltzherr</w:t>
+      </w:r>
+      <w:r>
+        <w:t xml:space="preserve"> </w:t>
+      </w:r>
+      <w:r>
+        <w:t xml:space="preserve">(18)</w:t>
+      </w:r>
+      <w:r>
+        <w:t xml:space="preserve"> </w:t>
+      </w:r>
+      <w:r>
+        <w:t xml:space="preserve">from a Dutch trauma center reported that</w:t>
       </w:r>
       <w:r>
         <w:t xml:space="preserve"> </w:t>
@@ -27915,7 +27497,7 @@
         <w:t xml:space="preserve">“</w:t>
       </w:r>
       <w:r>
-        <w:t xml:space="preserve">missed diagnosis</w:t>
+        <w:t xml:space="preserve">delay in treatment</w:t>
       </w:r>
       <w:r>
         <w:t xml:space="preserve">”</w:t>
@@ -27924,67 +27506,58 @@
         <w:t xml:space="preserve"> </w:t>
       </w:r>
       <w:r>
-        <w:t xml:space="preserve">generally occur with lower frequencies with higher shock degrees, regardless of whether classed with BE or SBP. Do note that the low frequencies of OFI in the severe shock classes, limit this theory with higher chance of randomness.</w:t>
-      </w:r>
-    </w:p>
-    <w:p>
-      <w:pPr>
-        <w:pStyle w:val="BodyText"/>
-      </w:pPr>
-      <w:r>
-        <w:t xml:space="preserve">The second theory is survival bias, where the reduced odds of OFI may be explained by that this study only incorporated the surviving patients. This may result in only the most optimally cared patients surviving. Patients with BE &lt; -10 also have high mortality rates</w:t>
-      </w:r>
-      <w:r>
-        <w:t xml:space="preserve"> </w:t>
-      </w:r>
-      <w:r>
-        <w:t xml:space="preserve">(13)</w:t>
-      </w:r>
-      <w:r>
-        <w:t xml:space="preserve">. Hypothetically, this would result in the severe classes of shock, with more dying patients with OFIs being eliminated from the data, due to death as the outcome.</w:t>
-      </w:r>
-    </w:p>
-    <w:p>
-      <w:pPr>
-        <w:pStyle w:val="BodyText"/>
-      </w:pPr>
-      <w:r>
-        <w:t xml:space="preserve">The reversal of OR and distribution of statistical significance may be attributed to multicollinearity, as both BE and ISS assess injury severity. Theoretically, anatomical injury, bleeding, and physiological response should be closely interconnected. A correlation between ISS and BD (inverted BE) or SBP was also shown in the two studies by Mutscher et al.</w:t>
-      </w:r>
-      <w:r>
-        <w:t xml:space="preserve"> </w:t>
-      </w:r>
-      <w:r>
-        <w:t xml:space="preserve">(12,13)</w:t>
-      </w:r>
-      <w:r>
-        <w:t xml:space="preserve">. Therefore, adjusting for each other may generate results that are difficult to interpret. This may also explain why classes 2 and 3 are no longer statistically significant, whereas class 4 remains significant.</w:t>
-      </w:r>
-    </w:p>
-    <w:p>
-      <w:pPr>
-        <w:pStyle w:val="BodyText"/>
-      </w:pPr>
-      <w:r>
-        <w:t xml:space="preserve">One other factor which may have contributed to this pattern of results, especially the distribution of significant classes and not as much the reversal after adjustment with ISS, was that ISS was included as a continuous (linear) variable in the model. As shown by Albaaj et al.</w:t>
-      </w:r>
-      <w:r>
-        <w:t xml:space="preserve"> </w:t>
-      </w:r>
-      <w:r>
-        <w:t xml:space="preserve">(17)</w:t>
-      </w:r>
-      <w:r>
-        <w:t xml:space="preserve">, increases in ISS do not correspond proportionally to increases in the likelihood of OFI. Therefore, its relationship with opportunities for improvement (OFI) is likely not linear, which results in different statistical significances between the classes.</w:t>
-      </w:r>
-    </w:p>
-    <w:bookmarkStart w:id="44" w:name="comparison-to-literature"/>
-    <w:p>
-      <w:pPr>
-        <w:pStyle w:val="Heading3"/>
-      </w:pPr>
-      <w:r>
-        <w:t xml:space="preserve">Comparison to literature</w:t>
+        <w:t xml:space="preserve">or</w:t>
+      </w:r>
+      <w:r>
+        <w:t xml:space="preserve"> </w:t>
+      </w:r>
+      <w:r>
+        <w:t xml:space="preserve">“</w:t>
+      </w:r>
+      <w:r>
+        <w:t xml:space="preserve">error in management</w:t>
+      </w:r>
+      <w:r>
+        <w:t xml:space="preserve">”</w:t>
+      </w:r>
+      <w:r>
+        <w:t xml:space="preserve"> </w:t>
+      </w:r>
+      <w:r>
+        <w:t xml:space="preserve">was the most common error type. Similarly, Martin et al.</w:t>
+      </w:r>
+      <w:r>
+        <w:t xml:space="preserve"> </w:t>
+      </w:r>
+      <w:r>
+        <w:t xml:space="preserve">(19)</w:t>
+      </w:r>
+      <w:r>
+        <w:t xml:space="preserve"> </w:t>
+      </w:r>
+      <w:r>
+        <w:t xml:space="preserve">found that delays to surgery were significant contributors to adverse outcomes, for a military hospital in Baghdad. Teixeira et al.</w:t>
+      </w:r>
+      <w:r>
+        <w:t xml:space="preserve"> </w:t>
+      </w:r>
+      <w:r>
+        <w:t xml:space="preserve">(3)</w:t>
+      </w:r>
+      <w:r>
+        <w:t xml:space="preserve">, analyzing preventable deaths in a mature trauma center, also confirmed the impact of delayed treatment and poor clinical decision-making. As seen in studies mentioned, clinical decision making and delay in treatment consistently emerged as the most frequent across studies. This suggests that these types of OFIs that were common in the general trauma population were similarly frequent in patients in shock. Moreover, this pattern appears consistent regardless of the studied population, whether the focus was on preventable deaths or on patients who survived their injuries.</w:t>
+      </w:r>
+    </w:p>
+    <w:bookmarkEnd w:id="47"/>
+    <w:bookmarkEnd w:id="48"/>
+    <w:bookmarkEnd w:id="49"/>
+    <w:bookmarkStart w:id="50" w:name="conclusion-1"/>
+    <w:p>
+      <w:pPr>
+        <w:pStyle w:val="Heading1"/>
+      </w:pPr>
+      <w:r>
+        <w:t xml:space="preserve">Conclusion</w:t>
       </w:r>
     </w:p>
     <w:p>
@@ -27992,161 +27565,17 @@
         <w:pStyle w:val="FirstParagraph"/>
       </w:pPr>
       <w:r>
-        <w:t xml:space="preserve">A previous study by O’Reilly et al</w:t>
-      </w:r>
-      <w:r>
-        <w:t xml:space="preserve"> </w:t>
-      </w:r>
-      <w:r>
-        <w:t xml:space="preserve">(8)</w:t>
-      </w:r>
-      <w:r>
-        <w:t xml:space="preserve">, which looked into opportunities for performance improvements (OPI) in 7511 cases, whereof 127 patients whose death was affected by hemorrhage, found that the most common OPI was related to decision making (63 out of 150 OPIs). This aligns with our findings that patients in shock (Class 2-4) were most affected by the OFI,</w:t>
-      </w:r>
-      <w:r>
-        <w:t xml:space="preserve"> </w:t>
-      </w:r>
-      <w:r>
-        <w:t xml:space="preserve">“</w:t>
-      </w:r>
-      <w:r>
-        <w:t xml:space="preserve">clinical judgment error</w:t>
-      </w:r>
-      <w:r>
-        <w:t xml:space="preserve">”</w:t>
-      </w:r>
-      <w:r>
-        <w:t xml:space="preserve"> </w:t>
-      </w:r>
-      <w:r>
-        <w:t xml:space="preserve">(BE 34.7%; SBP 35.3%).</w:t>
-      </w:r>
-    </w:p>
-    <w:p>
-      <w:pPr>
-        <w:pStyle w:val="BodyText"/>
-      </w:pPr>
-      <w:r>
-        <w:t xml:space="preserve">No studies were found that specifically examined OFIs in patients in hemorrhagic shock, but studies on OFIs in general trauma populations show results in a similar theme. A study by T.P. Saltzherr</w:t>
-      </w:r>
-      <w:r>
-        <w:t xml:space="preserve"> </w:t>
-      </w:r>
-      <w:r>
-        <w:t xml:space="preserve">(18)</w:t>
-      </w:r>
-      <w:r>
-        <w:t xml:space="preserve"> </w:t>
-      </w:r>
-      <w:r>
-        <w:t xml:space="preserve">from a Dutch trauma center reported that</w:t>
-      </w:r>
-      <w:r>
-        <w:t xml:space="preserve"> </w:t>
-      </w:r>
-      <w:r>
-        <w:t xml:space="preserve">“</w:t>
-      </w:r>
-      <w:r>
-        <w:t xml:space="preserve">delay in treatment</w:t>
-      </w:r>
-      <w:r>
-        <w:t xml:space="preserve">”</w:t>
-      </w:r>
-      <w:r>
-        <w:t xml:space="preserve"> </w:t>
-      </w:r>
-      <w:r>
-        <w:t xml:space="preserve">or</w:t>
-      </w:r>
-      <w:r>
-        <w:t xml:space="preserve"> </w:t>
-      </w:r>
-      <w:r>
-        <w:t xml:space="preserve">“</w:t>
-      </w:r>
-      <w:r>
-        <w:t xml:space="preserve">error in management</w:t>
-      </w:r>
-      <w:r>
-        <w:t xml:space="preserve">”</w:t>
-      </w:r>
-      <w:r>
-        <w:t xml:space="preserve"> </w:t>
-      </w:r>
-      <w:r>
-        <w:t xml:space="preserve">was the most common error type. Similarly, Martin et al.</w:t>
-      </w:r>
-      <w:r>
-        <w:t xml:space="preserve"> </w:t>
-      </w:r>
-      <w:r>
-        <w:t xml:space="preserve">(19)</w:t>
-      </w:r>
-      <w:r>
-        <w:t xml:space="preserve"> </w:t>
-      </w:r>
-      <w:r>
-        <w:t xml:space="preserve">found that delays to surgery were significant contributors to adverse outcomes, for a military hospital in Baghdad. Sanddal et al</w:t>
-      </w:r>
-      <w:r>
-        <w:t xml:space="preserve"> </w:t>
-      </w:r>
-      <w:r>
-        <w:t xml:space="preserve">(20)</w:t>
-      </w:r>
-      <w:r>
-        <w:t xml:space="preserve"> </w:t>
-      </w:r>
-      <w:r>
-        <w:t xml:space="preserve">identified the main issues of care for a trauma system in development in Utah as chest injury diagnostic and management, airway management, and fluid resuscitation. Teixeira et al.</w:t>
-      </w:r>
-      <w:r>
-        <w:t xml:space="preserve"> </w:t>
-      </w:r>
-      <w:r>
-        <w:t xml:space="preserve">(3)</w:t>
-      </w:r>
-      <w:r>
-        <w:t xml:space="preserve">, analyzing preventable deaths in a mature trauma center, also confirmed the impact of delayed treatment and poor clinical decision-making.</w:t>
-      </w:r>
-    </w:p>
-    <w:p>
-      <w:pPr>
-        <w:pStyle w:val="BodyText"/>
-      </w:pPr>
-      <w:r>
-        <w:t xml:space="preserve">In comparison, our study found that</w:t>
-      </w:r>
-      <w:r>
-        <w:t xml:space="preserve"> </w:t>
-      </w:r>
-      <w:r>
-        <w:t xml:space="preserve">“</w:t>
-      </w:r>
-      <w:r>
-        <w:t xml:space="preserve">clinical judgment error</w:t>
-      </w:r>
-      <w:r>
-        <w:t xml:space="preserve">”</w:t>
-      </w:r>
-      <w:r>
-        <w:t xml:space="preserve"> </w:t>
-      </w:r>
-      <w:r>
-        <w:t xml:space="preserve">was the most common OFI for all patients and patients in shock. While the relative ranking may vary, whether delay in treatment or clinical judgment error is most common, these two categories consistently emerged as the most frequent across studies. This also suggests that the types of OFIs that were common in the general trauma population were similarly frequent in patients in shock. Moreover, this pattern appears consistent regardless of the studied population, whether the focus was on preventable deaths or on patients who survived their injuries.</w:t>
-      </w:r>
-    </w:p>
-    <w:bookmarkEnd w:id="44"/>
-    <w:bookmarkEnd w:id="45"/>
-    <w:bookmarkEnd w:id="46"/>
-    <w:bookmarkStart w:id="47" w:name="conclusion-1"/>
+        <w:t xml:space="preserve">Clinical judgment error was the most common OFI among patients in shock. The association between shock severity and OFI does not seem to be linear. The findings suggest that patients with less pronounced physiological shock according to BE may be more vulnerable to variation in initial management. These findings emphasize the importance of standardized protocols for initial management of patients who arrive in shock but are not in extremis.</w:t>
+      </w:r>
+    </w:p>
+    <w:bookmarkEnd w:id="50"/>
+    <w:bookmarkStart w:id="51" w:name="contributions"/>
     <w:p>
       <w:pPr>
         <w:pStyle w:val="Heading1"/>
       </w:pPr>
       <w:r>
-        <w:t xml:space="preserve">Conclusion</w:t>
+        <w:t xml:space="preserve">Contributions</w:t>
       </w:r>
     </w:p>
     <w:p>
@@ -28154,41 +27583,23 @@
         <w:pStyle w:val="FirstParagraph"/>
       </w:pPr>
       <w:r>
-        <w:t xml:space="preserve">Clinical judgment error was the most common OFI in shock patients. The association between shock and OFI does not seem to be linear, but rather the moderate shock has higher odds of OFI compared to the mild and severe shocks. These findings emphasize the importance of improved protocols for initial management of non-critical patients to minimise decision error.</w:t>
-      </w:r>
-    </w:p>
-    <w:bookmarkEnd w:id="47"/>
-    <w:bookmarkStart w:id="48" w:name="contributions"/>
+        <w:t xml:space="preserve">Martin Gerdin Wärnberg: Conceptualization (lead); data curation; funding acquisition; investigation; methodology; project administration; resources (lead); software; supervision (lead); writing - review &amp; editing. Carl Skog: Conceptualization (support); formal analysis; visualization; writing - original draft preparation. Johanna Berg: supervision (support). Jonatan Attergrim: Supervision (support). Kelvin Szonoky: Resources (support); Supervision (support).</w:t>
+      </w:r>
+    </w:p>
+    <w:bookmarkEnd w:id="51"/>
+    <w:bookmarkStart w:id="52" w:name="references"/>
     <w:p>
       <w:pPr>
         <w:pStyle w:val="Heading1"/>
       </w:pPr>
       <w:r>
-        <w:t xml:space="preserve">Contributions</w:t>
-      </w:r>
-    </w:p>
-    <w:p>
-      <w:pPr>
-        <w:pStyle w:val="FirstParagraph"/>
-      </w:pPr>
-      <w:r>
-        <w:t xml:space="preserve">Data collection from the trauma registry, ethics application and study designed by Martin Gerdin Wärnberg. Carl sorted, programmed and analyzed the data, and then wrote the thesis with support from Martin Gerdin Wärnberg, Johanna Berg, Jonatan Attergrim and Kelvin Szolnoky.</w:t>
-      </w:r>
-    </w:p>
-    <w:bookmarkEnd w:id="48"/>
-    <w:bookmarkStart w:id="49" w:name="references"/>
-    <w:p>
-      <w:pPr>
-        <w:pStyle w:val="Heading1"/>
-      </w:pPr>
-      <w:r>
         <w:t xml:space="preserve">References</w:t>
       </w:r>
     </w:p>
-    <w:bookmarkEnd w:id="49"/>
-    <w:bookmarkEnd w:id="50"/>
-    <w:bookmarkStart w:id="91" w:name="refs"/>
-    <w:bookmarkStart w:id="52" w:name="ref-noauthor_injuries_nodate"/>
+    <w:bookmarkEnd w:id="52"/>
+    <w:bookmarkEnd w:id="53"/>
+    <w:bookmarkStart w:id="92" w:name="refs"/>
+    <w:bookmarkStart w:id="55" w:name="ref-noauthor_injuries_nodate"/>
     <w:p>
       <w:pPr>
         <w:pStyle w:val="Bibliography"/>
@@ -28208,7 +27619,7 @@
       <w:r>
         <w:t xml:space="preserve"> </w:t>
       </w:r>
-      <w:hyperlink r:id="rId51">
+      <w:hyperlink r:id="rId54">
         <w:r>
           <w:rPr>
             <w:rStyle w:val="Hyperlink"/>
@@ -28217,8 +27628,8 @@
         </w:r>
       </w:hyperlink>
     </w:p>
-    <w:bookmarkEnd w:id="52"/>
-    <w:bookmarkStart w:id="54" w:name="ref-mackersie_pitfalls_2010"/>
+    <w:bookmarkEnd w:id="55"/>
+    <w:bookmarkStart w:id="57" w:name="ref-mackersie_pitfalls_2010"/>
     <w:p>
       <w:pPr>
         <w:pStyle w:val="Bibliography"/>
@@ -28277,7 +27688,7 @@
       <w:r>
         <w:t xml:space="preserve"> </w:t>
       </w:r>
-      <w:hyperlink r:id="rId53">
+      <w:hyperlink r:id="rId56">
         <w:r>
           <w:rPr>
             <w:rStyle w:val="Hyperlink"/>
@@ -28286,8 +27697,8 @@
         </w:r>
       </w:hyperlink>
     </w:p>
-    <w:bookmarkEnd w:id="54"/>
-    <w:bookmarkStart w:id="56" w:name="ref-teixeira_preventable_2007"/>
+    <w:bookmarkEnd w:id="57"/>
+    <w:bookmarkStart w:id="59" w:name="ref-teixeira_preventable_2007"/>
     <w:p>
       <w:pPr>
         <w:pStyle w:val="Bibliography"/>
@@ -28307,7 +27718,7 @@
       <w:r>
         <w:t xml:space="preserve"> </w:t>
       </w:r>
-      <w:hyperlink r:id="rId55">
+      <w:hyperlink r:id="rId58">
         <w:r>
           <w:rPr>
             <w:rStyle w:val="Hyperlink"/>
@@ -28322,8 +27733,8 @@
         <w:t xml:space="preserve"> </w:t>
       </w:r>
     </w:p>
-    <w:bookmarkEnd w:id="56"/>
-    <w:bookmarkStart w:id="58" w:name="ref-ivatury_patient_2008"/>
+    <w:bookmarkEnd w:id="59"/>
+    <w:bookmarkStart w:id="61" w:name="ref-ivatury_patient_2008"/>
     <w:p>
       <w:pPr>
         <w:pStyle w:val="Bibliography"/>
@@ -28343,7 +27754,7 @@
       <w:r>
         <w:t xml:space="preserve"> </w:t>
       </w:r>
-      <w:hyperlink r:id="rId57">
+      <w:hyperlink r:id="rId60">
         <w:r>
           <w:rPr>
             <w:rStyle w:val="Hyperlink"/>
@@ -28382,8 +27793,8 @@
         <w:t xml:space="preserve"> </w:t>
       </w:r>
     </w:p>
-    <w:bookmarkEnd w:id="58"/>
-    <w:bookmarkStart w:id="60" w:name="X9db8e71a0533962266d08f8a7d5abffdfc5204c"/>
+    <w:bookmarkEnd w:id="61"/>
+    <w:bookmarkStart w:id="63" w:name="X9db8e71a0533962266d08f8a7d5abffdfc5204c"/>
     <w:p>
       <w:pPr>
         <w:pStyle w:val="Bibliography"/>
@@ -28403,7 +27814,7 @@
       <w:r>
         <w:t xml:space="preserve"> </w:t>
       </w:r>
-      <w:hyperlink r:id="rId59">
+      <w:hyperlink r:id="rId62">
         <w:r>
           <w:rPr>
             <w:rStyle w:val="Hyperlink"/>
@@ -28412,8 +27823,8 @@
         </w:r>
       </w:hyperlink>
     </w:p>
-    <w:bookmarkEnd w:id="60"/>
-    <w:bookmarkStart w:id="62" w:name="ref-kauvar_impact_2006"/>
+    <w:bookmarkEnd w:id="63"/>
+    <w:bookmarkStart w:id="65" w:name="ref-kauvar_impact_2006"/>
     <w:p>
       <w:pPr>
         <w:pStyle w:val="Bibliography"/>
@@ -28517,7 +27928,7 @@
       <w:r>
         <w:t xml:space="preserve"> </w:t>
       </w:r>
-      <w:hyperlink r:id="rId61">
+      <w:hyperlink r:id="rId64">
         <w:r>
           <w:rPr>
             <w:rStyle w:val="Hyperlink"/>
@@ -28526,8 +27937,8 @@
         </w:r>
       </w:hyperlink>
     </w:p>
-    <w:bookmarkEnd w:id="62"/>
-    <w:bookmarkStart w:id="64" w:name="ref-berry_shock_2015"/>
+    <w:bookmarkEnd w:id="65"/>
+    <w:bookmarkStart w:id="67" w:name="ref-berry_shock_2015"/>
     <w:p>
       <w:pPr>
         <w:pStyle w:val="Bibliography"/>
@@ -28586,7 +27997,7 @@
       <w:r>
         <w:t xml:space="preserve"> </w:t>
       </w:r>
-      <w:hyperlink r:id="rId63">
+      <w:hyperlink r:id="rId66">
         <w:r>
           <w:rPr>
             <w:rStyle w:val="Hyperlink"/>
@@ -28595,8 +28006,8 @@
         </w:r>
       </w:hyperlink>
     </w:p>
-    <w:bookmarkEnd w:id="64"/>
-    <w:bookmarkStart w:id="66" w:name="ref-oreilly_opportunities_2013"/>
+    <w:bookmarkEnd w:id="67"/>
+    <w:bookmarkStart w:id="69" w:name="ref-oreilly_opportunities_2013"/>
     <w:p>
       <w:pPr>
         <w:pStyle w:val="Bibliography"/>
@@ -28616,7 +28027,7 @@
       <w:r>
         <w:t xml:space="preserve"> </w:t>
       </w:r>
-      <w:hyperlink r:id="rId65">
+      <w:hyperlink r:id="rId68">
         <w:r>
           <w:rPr>
             <w:rStyle w:val="Hyperlink"/>
@@ -28625,8 +28036,8 @@
         </w:r>
       </w:hyperlink>
     </w:p>
-    <w:bookmarkEnd w:id="66"/>
-    <w:bookmarkStart w:id="68" w:name="ref-noauthor_atls_2018"/>
+    <w:bookmarkEnd w:id="69"/>
+    <w:bookmarkStart w:id="71" w:name="ref-noauthor_atls_2018"/>
     <w:p>
       <w:pPr>
         <w:pStyle w:val="Bibliography"/>
@@ -28652,7 +28063,7 @@
       <w:r>
         <w:t xml:space="preserve"> </w:t>
       </w:r>
-      <w:hyperlink r:id="rId67">
+      <w:hyperlink r:id="rId70">
         <w:r>
           <w:rPr>
             <w:rStyle w:val="Hyperlink"/>
@@ -28661,8 +28072,8 @@
         </w:r>
       </w:hyperlink>
     </w:p>
-    <w:bookmarkEnd w:id="68"/>
-    <w:bookmarkStart w:id="70" w:name="ref-eastridge_hypotension_2007"/>
+    <w:bookmarkEnd w:id="71"/>
+    <w:bookmarkStart w:id="73" w:name="ref-eastridge_hypotension_2007"/>
     <w:p>
       <w:pPr>
         <w:pStyle w:val="Bibliography"/>
@@ -28682,7 +28093,7 @@
       <w:r>
         <w:t xml:space="preserve"> </w:t>
       </w:r>
-      <w:hyperlink r:id="rId69">
+      <w:hyperlink r:id="rId72">
         <w:r>
           <w:rPr>
             <w:rStyle w:val="Hyperlink"/>
@@ -28715,8 +28126,8 @@
         <w:t xml:space="preserve"> </w:t>
       </w:r>
     </w:p>
-    <w:bookmarkEnd w:id="70"/>
-    <w:bookmarkStart w:id="72" w:name="ref-oyetunji_redefining_2011"/>
+    <w:bookmarkEnd w:id="73"/>
+    <w:bookmarkStart w:id="75" w:name="ref-oyetunji_redefining_2011"/>
     <w:p>
       <w:pPr>
         <w:pStyle w:val="Bibliography"/>
@@ -28736,7 +28147,7 @@
       <w:r>
         <w:t xml:space="preserve"> </w:t>
       </w:r>
-      <w:hyperlink r:id="rId71">
+      <w:hyperlink r:id="rId74">
         <w:r>
           <w:rPr>
             <w:rStyle w:val="Hyperlink"/>
@@ -28751,8 +28162,8 @@
         <w:t xml:space="preserve"> </w:t>
       </w:r>
     </w:p>
-    <w:bookmarkEnd w:id="72"/>
-    <w:bookmarkStart w:id="74" w:name="ref-mutschler_critical_2013"/>
+    <w:bookmarkEnd w:id="75"/>
+    <w:bookmarkStart w:id="77" w:name="ref-mutschler_critical_2013"/>
     <w:p>
       <w:pPr>
         <w:pStyle w:val="Bibliography"/>
@@ -28796,7 +28207,7 @@
       <w:r>
         <w:t xml:space="preserve"> </w:t>
       </w:r>
-      <w:hyperlink r:id="rId73">
+      <w:hyperlink r:id="rId76">
         <w:r>
           <w:rPr>
             <w:rStyle w:val="Hyperlink"/>
@@ -28805,8 +28216,8 @@
         </w:r>
       </w:hyperlink>
     </w:p>
-    <w:bookmarkEnd w:id="74"/>
-    <w:bookmarkStart w:id="76" w:name="ref-mutschler_renaissance_2013"/>
+    <w:bookmarkEnd w:id="77"/>
+    <w:bookmarkStart w:id="79" w:name="ref-mutschler_renaissance_2013"/>
     <w:p>
       <w:pPr>
         <w:pStyle w:val="Bibliography"/>
@@ -28841,7 +28252,7 @@
       <w:r>
         <w:t xml:space="preserve"> </w:t>
       </w:r>
-      <w:hyperlink r:id="rId75">
+      <w:hyperlink r:id="rId78">
         <w:r>
           <w:rPr>
             <w:rStyle w:val="Hyperlink"/>
@@ -28850,8 +28261,8 @@
         </w:r>
       </w:hyperlink>
     </w:p>
-    <w:bookmarkEnd w:id="76"/>
-    <w:bookmarkStart w:id="78" w:name="ref-yucel_trauma_2006"/>
+    <w:bookmarkEnd w:id="79"/>
+    <w:bookmarkStart w:id="81" w:name="ref-yucel_trauma_2006"/>
     <w:p>
       <w:pPr>
         <w:pStyle w:val="Bibliography"/>
@@ -28871,7 +28282,7 @@
       <w:r>
         <w:t xml:space="preserve"> </w:t>
       </w:r>
-      <w:hyperlink r:id="rId77">
+      <w:hyperlink r:id="rId80">
         <w:r>
           <w:rPr>
             <w:rStyle w:val="Hyperlink"/>
@@ -28958,8 +28369,8 @@
         <w:t xml:space="preserve"> </w:t>
       </w:r>
     </w:p>
-    <w:bookmarkEnd w:id="78"/>
-    <w:bookmarkStart w:id="80" w:name="ref-ogura_modified_2016"/>
+    <w:bookmarkEnd w:id="81"/>
+    <w:bookmarkStart w:id="83" w:name="ref-ogura_modified_2016"/>
     <w:p>
       <w:pPr>
         <w:pStyle w:val="Bibliography"/>
@@ -28979,7 +28390,7 @@
       <w:r>
         <w:t xml:space="preserve"> </w:t>
       </w:r>
-      <w:hyperlink r:id="rId79">
+      <w:hyperlink r:id="rId82">
         <w:r>
           <w:rPr>
             <w:rStyle w:val="Hyperlink"/>
@@ -28994,8 +28405,8 @@
         <w:t xml:space="preserve"> </w:t>
       </w:r>
     </w:p>
-    <w:bookmarkEnd w:id="80"/>
-    <w:bookmarkStart w:id="82" w:name="ref-hanlin_prehospital_2024"/>
+    <w:bookmarkEnd w:id="83"/>
+    <w:bookmarkStart w:id="85" w:name="ref-hanlin_prehospital_2024"/>
     <w:p>
       <w:pPr>
         <w:pStyle w:val="Bibliography"/>
@@ -29015,7 +28426,7 @@
       <w:r>
         <w:t xml:space="preserve"> </w:t>
       </w:r>
-      <w:hyperlink r:id="rId81">
+      <w:hyperlink r:id="rId84">
         <w:r>
           <w:rPr>
             <w:rStyle w:val="Hyperlink"/>
@@ -29138,8 +28549,8 @@
         <w:t xml:space="preserve"> </w:t>
       </w:r>
     </w:p>
-    <w:bookmarkEnd w:id="82"/>
-    <w:bookmarkStart w:id="84" w:name="ref-albaaj_patient_2023"/>
+    <w:bookmarkEnd w:id="85"/>
+    <w:bookmarkStart w:id="87" w:name="ref-albaaj_patient_2023"/>
     <w:p>
       <w:pPr>
         <w:pStyle w:val="Bibliography"/>
@@ -29159,7 +28570,7 @@
       <w:r>
         <w:t xml:space="preserve"> </w:t>
       </w:r>
-      <w:hyperlink r:id="rId83">
+      <w:hyperlink r:id="rId86">
         <w:r>
           <w:rPr>
             <w:rStyle w:val="Hyperlink"/>
@@ -29168,8 +28579,8 @@
         </w:r>
       </w:hyperlink>
     </w:p>
-    <w:bookmarkEnd w:id="84"/>
-    <w:bookmarkStart w:id="86" w:name="ref-saltzherr_preventability_2011"/>
+    <w:bookmarkEnd w:id="87"/>
+    <w:bookmarkStart w:id="89" w:name="ref-saltzherr_preventability_2011"/>
     <w:p>
       <w:pPr>
         <w:pStyle w:val="Bibliography"/>
@@ -29204,7 +28615,7 @@
       <w:r>
         <w:t xml:space="preserve"> </w:t>
       </w:r>
-      <w:hyperlink r:id="rId85">
+      <w:hyperlink r:id="rId88">
         <w:r>
           <w:rPr>
             <w:rStyle w:val="Hyperlink"/>
@@ -29213,8 +28624,8 @@
         </w:r>
       </w:hyperlink>
     </w:p>
-    <w:bookmarkEnd w:id="86"/>
-    <w:bookmarkStart w:id="88" w:name="ref-martin_analysis_2009"/>
+    <w:bookmarkEnd w:id="89"/>
+    <w:bookmarkStart w:id="91" w:name="ref-martin_analysis_2009"/>
     <w:p>
       <w:pPr>
         <w:pStyle w:val="Bibliography"/>
@@ -29234,7 +28645,7 @@
       <w:r>
         <w:t xml:space="preserve"> </w:t>
       </w:r>
-      <w:hyperlink r:id="rId87">
+      <w:hyperlink r:id="rId90">
         <w:r>
           <w:rPr>
             <w:rStyle w:val="Hyperlink"/>
@@ -29249,45 +28660,9 @@
         <w:t xml:space="preserve"> </w:t>
       </w:r>
     </w:p>
-    <w:bookmarkEnd w:id="88"/>
-    <w:bookmarkStart w:id="90" w:name="ref-sanddal_analysis_2011"/>
-    <w:p>
-      <w:pPr>
-        <w:pStyle w:val="Bibliography"/>
-      </w:pPr>
-      <w:r>
-        <w:t xml:space="preserve">20.</w:t>
-      </w:r>
-      <w:r>
-        <w:t xml:space="preserve"> </w:t>
-      </w:r>
-      <w:r>
-        <w:t xml:space="preserve">	</w:t>
-      </w:r>
-      <w:r>
-        <w:t xml:space="preserve">Sanddal TL, Esposito TJ, Whitney JR, Hartford D, Taillac PP, Mann NC, et al.</w:t>
-      </w:r>
-      <w:r>
-        <w:t xml:space="preserve"> </w:t>
-      </w:r>
-      <w:hyperlink r:id="rId89">
-        <w:r>
-          <w:rPr>
-            <w:rStyle w:val="Hyperlink"/>
-          </w:rPr>
-          <w:t xml:space="preserve">Analysis of preventable trauma deaths and opportunities for trauma care improvement in utah</w:t>
-        </w:r>
-      </w:hyperlink>
-      <w:r>
-        <w:t xml:space="preserve">. The Journal of Trauma. 2011 Apr;70(4):970–7.</w:t>
-      </w:r>
-      <w:r>
-        <w:t xml:space="preserve"> </w:t>
-      </w:r>
-    </w:p>
-    <w:bookmarkEnd w:id="90"/>
     <w:bookmarkEnd w:id="91"/>
     <w:bookmarkEnd w:id="92"/>
+    <w:bookmarkEnd w:id="93"/>
     <w:sectPr/>
   </w:body>
 </w:document>

</xml_diff>